<commit_message>
Best efforts to merge changes from english user manual into dutch user manual.
</commit_message>
<xml_diff>
--- a/Documentation/Official Documentation/Gebruikershandleiding voor IBOS XML muzieklezer versie 5.0.0.0.docx
+++ b/Documentation/Official Documentation/Gebruikershandleiding voor IBOS XML muzieklezer versie 5.0.0.0.docx
@@ -37,9 +37,17 @@
           <w:sz w:val="40"/>
           <w:szCs w:val="40"/>
         </w:rPr>
-        <w:t>IBOS XML-muzieklezer versie 4.0.0.0</w:t>
+        <w:t>IBOS XML-muzieklezer versie 5</w:t>
       </w:r>
       <w:bookmarkEnd w:id="1"/>
+      <w:r>
+        <w:rPr>
+          <w:rFonts w:ascii="Verdana" w:hAnsi="Verdana"/>
+          <w:sz w:val="40"/>
+          <w:szCs w:val="40"/>
+        </w:rPr>
+        <w:t>.0.0.0</w:t>
+      </w:r>
     </w:p>
     <w:p>
       <w:pPr>
@@ -162,7 +170,7 @@
                 <w:rStyle w:val="Indeksspring"/>
                 <w:rFonts w:ascii="Verdana" w:hAnsi="Verdana"/>
               </w:rPr>
-              <w:t>IBOS XML-muzieklezer versie 4.0.0.0</w:t>
+              <w:t>IBOS XML-muzieklezer versie 5.0.0.0</w:t>
             </w:r>
             <w:r>
               <w:rPr>
@@ -2506,14 +2514,14 @@
         <w:tblLook w:firstRow="1" w:noVBand="1" w:lastRow="0" w:firstColumn="1" w:lastColumn="0" w:noHBand="0" w:val="04a0"/>
       </w:tblPr>
       <w:tblGrid>
-        <w:gridCol w:w="1683"/>
-        <w:gridCol w:w="7492"/>
+        <w:gridCol w:w="1682"/>
+        <w:gridCol w:w="7493"/>
       </w:tblGrid>
       <w:tr>
         <w:trPr/>
         <w:tc>
           <w:tcPr>
-            <w:tcW w:w="1683" w:type="dxa"/>
+            <w:tcW w:w="1682" w:type="dxa"/>
             <w:tcBorders>
               <w:top w:val="single" w:sz="4" w:space="0" w:color="000000"/>
               <w:left w:val="single" w:sz="4" w:space="0" w:color="000000"/>
@@ -2544,7 +2552,7 @@
         </w:tc>
         <w:tc>
           <w:tcPr>
-            <w:tcW w:w="7492" w:type="dxa"/>
+            <w:tcW w:w="7493" w:type="dxa"/>
             <w:tcBorders>
               <w:top w:val="single" w:sz="4" w:space="0" w:color="000000"/>
               <w:left w:val="single" w:sz="4" w:space="0" w:color="000000"/>
@@ -2589,7 +2597,7 @@
         <w:trPr/>
         <w:tc>
           <w:tcPr>
-            <w:tcW w:w="1683" w:type="dxa"/>
+            <w:tcW w:w="1682" w:type="dxa"/>
             <w:tcBorders>
               <w:top w:val="single" w:sz="4" w:space="0" w:color="000000"/>
               <w:left w:val="single" w:sz="4" w:space="0" w:color="000000"/>
@@ -2620,7 +2628,7 @@
         </w:tc>
         <w:tc>
           <w:tcPr>
-            <w:tcW w:w="7492" w:type="dxa"/>
+            <w:tcW w:w="7493" w:type="dxa"/>
             <w:tcBorders>
               <w:top w:val="single" w:sz="4" w:space="0" w:color="000000"/>
               <w:left w:val="single" w:sz="4" w:space="0" w:color="000000"/>
@@ -2693,7 +2701,7 @@
         <w:trPr/>
         <w:tc>
           <w:tcPr>
-            <w:tcW w:w="1683" w:type="dxa"/>
+            <w:tcW w:w="1682" w:type="dxa"/>
             <w:tcBorders>
               <w:top w:val="single" w:sz="4" w:space="0" w:color="000000"/>
               <w:left w:val="single" w:sz="4" w:space="0" w:color="000000"/>
@@ -2724,7 +2732,7 @@
         </w:tc>
         <w:tc>
           <w:tcPr>
-            <w:tcW w:w="7492" w:type="dxa"/>
+            <w:tcW w:w="7493" w:type="dxa"/>
             <w:tcBorders>
               <w:top w:val="single" w:sz="4" w:space="0" w:color="000000"/>
               <w:left w:val="single" w:sz="4" w:space="0" w:color="000000"/>
@@ -2755,7 +2763,7 @@
         <w:trPr/>
         <w:tc>
           <w:tcPr>
-            <w:tcW w:w="1683" w:type="dxa"/>
+            <w:tcW w:w="1682" w:type="dxa"/>
             <w:tcBorders>
               <w:top w:val="single" w:sz="4" w:space="0" w:color="000000"/>
               <w:left w:val="single" w:sz="4" w:space="0" w:color="000000"/>
@@ -2786,7 +2794,7 @@
         </w:tc>
         <w:tc>
           <w:tcPr>
-            <w:tcW w:w="7492" w:type="dxa"/>
+            <w:tcW w:w="7493" w:type="dxa"/>
             <w:tcBorders>
               <w:top w:val="single" w:sz="4" w:space="0" w:color="000000"/>
               <w:left w:val="single" w:sz="4" w:space="0" w:color="000000"/>
@@ -2833,7 +2841,7 @@
         <w:trPr/>
         <w:tc>
           <w:tcPr>
-            <w:tcW w:w="1683" w:type="dxa"/>
+            <w:tcW w:w="1682" w:type="dxa"/>
             <w:tcBorders>
               <w:top w:val="single" w:sz="4" w:space="0" w:color="000000"/>
               <w:left w:val="single" w:sz="4" w:space="0" w:color="000000"/>
@@ -2867,7 +2875,7 @@
         </w:tc>
         <w:tc>
           <w:tcPr>
-            <w:tcW w:w="7492" w:type="dxa"/>
+            <w:tcW w:w="7493" w:type="dxa"/>
             <w:tcBorders>
               <w:top w:val="single" w:sz="4" w:space="0" w:color="000000"/>
               <w:left w:val="single" w:sz="4" w:space="0" w:color="000000"/>
@@ -3469,9 +3477,9 @@
         <w:tblLook w:firstRow="1" w:noVBand="1" w:lastRow="0" w:firstColumn="1" w:lastColumn="0" w:noHBand="0" w:val="04a0"/>
       </w:tblPr>
       <w:tblGrid>
-        <w:gridCol w:w="1583"/>
-        <w:gridCol w:w="5220"/>
-        <w:gridCol w:w="2212"/>
+        <w:gridCol w:w="1582"/>
+        <w:gridCol w:w="5219"/>
+        <w:gridCol w:w="2214"/>
       </w:tblGrid>
       <w:tr>
         <w:trPr>
@@ -3479,7 +3487,7 @@
         </w:trPr>
         <w:tc>
           <w:tcPr>
-            <w:tcW w:w="1583" w:type="dxa"/>
+            <w:tcW w:w="1582" w:type="dxa"/>
             <w:tcBorders>
               <w:top w:val="single" w:sz="2" w:space="0" w:color="000000"/>
               <w:left w:val="single" w:sz="2" w:space="0" w:color="000000"/>
@@ -3522,7 +3530,7 @@
         </w:tc>
         <w:tc>
           <w:tcPr>
-            <w:tcW w:w="5220" w:type="dxa"/>
+            <w:tcW w:w="5219" w:type="dxa"/>
             <w:tcBorders>
               <w:top w:val="single" w:sz="2" w:space="0" w:color="000000"/>
               <w:left w:val="single" w:sz="2" w:space="0" w:color="000000"/>
@@ -3549,7 +3557,7 @@
         </w:tc>
         <w:tc>
           <w:tcPr>
-            <w:tcW w:w="2212" w:type="dxa"/>
+            <w:tcW w:w="2214" w:type="dxa"/>
             <w:tcBorders>
               <w:top w:val="single" w:sz="2" w:space="0" w:color="000000"/>
               <w:left w:val="single" w:sz="2" w:space="0" w:color="000000"/>
@@ -3580,7 +3588,7 @@
         <w:trPr/>
         <w:tc>
           <w:tcPr>
-            <w:tcW w:w="1583" w:type="dxa"/>
+            <w:tcW w:w="1582" w:type="dxa"/>
             <w:tcBorders>
               <w:left w:val="single" w:sz="2" w:space="0" w:color="000000"/>
               <w:bottom w:val="single" w:sz="2" w:space="0" w:color="000000"/>
@@ -3603,7 +3611,7 @@
         </w:tc>
         <w:tc>
           <w:tcPr>
-            <w:tcW w:w="5220" w:type="dxa"/>
+            <w:tcW w:w="5219" w:type="dxa"/>
             <w:tcBorders>
               <w:left w:val="single" w:sz="2" w:space="0" w:color="000000"/>
               <w:bottom w:val="single" w:sz="2" w:space="0" w:color="000000"/>
@@ -3629,7 +3637,7 @@
         </w:tc>
         <w:tc>
           <w:tcPr>
-            <w:tcW w:w="2212" w:type="dxa"/>
+            <w:tcW w:w="2214" w:type="dxa"/>
             <w:tcBorders>
               <w:left w:val="single" w:sz="2" w:space="0" w:color="000000"/>
               <w:bottom w:val="single" w:sz="2" w:space="0" w:color="000000"/>
@@ -3656,7 +3664,7 @@
         <w:trPr/>
         <w:tc>
           <w:tcPr>
-            <w:tcW w:w="1583" w:type="dxa"/>
+            <w:tcW w:w="1582" w:type="dxa"/>
             <w:tcBorders>
               <w:left w:val="single" w:sz="2" w:space="0" w:color="000000"/>
               <w:bottom w:val="single" w:sz="2" w:space="0" w:color="000000"/>
@@ -3679,7 +3687,7 @@
         </w:tc>
         <w:tc>
           <w:tcPr>
-            <w:tcW w:w="5220" w:type="dxa"/>
+            <w:tcW w:w="5219" w:type="dxa"/>
             <w:tcBorders>
               <w:left w:val="single" w:sz="2" w:space="0" w:color="000000"/>
               <w:bottom w:val="single" w:sz="2" w:space="0" w:color="000000"/>
@@ -3702,7 +3710,7 @@
         </w:tc>
         <w:tc>
           <w:tcPr>
-            <w:tcW w:w="2212" w:type="dxa"/>
+            <w:tcW w:w="2214" w:type="dxa"/>
             <w:tcBorders>
               <w:left w:val="single" w:sz="2" w:space="0" w:color="000000"/>
               <w:bottom w:val="single" w:sz="2" w:space="0" w:color="000000"/>
@@ -3729,7 +3737,7 @@
         <w:trPr/>
         <w:tc>
           <w:tcPr>
-            <w:tcW w:w="1583" w:type="dxa"/>
+            <w:tcW w:w="1582" w:type="dxa"/>
             <w:tcBorders>
               <w:left w:val="single" w:sz="2" w:space="0" w:color="000000"/>
               <w:bottom w:val="single" w:sz="2" w:space="0" w:color="000000"/>
@@ -3752,7 +3760,7 @@
         </w:tc>
         <w:tc>
           <w:tcPr>
-            <w:tcW w:w="5220" w:type="dxa"/>
+            <w:tcW w:w="5219" w:type="dxa"/>
             <w:tcBorders>
               <w:left w:val="single" w:sz="2" w:space="0" w:color="000000"/>
               <w:bottom w:val="single" w:sz="2" w:space="0" w:color="000000"/>
@@ -3776,7 +3784,7 @@
         </w:tc>
         <w:tc>
           <w:tcPr>
-            <w:tcW w:w="2212" w:type="dxa"/>
+            <w:tcW w:w="2214" w:type="dxa"/>
             <w:tcBorders>
               <w:left w:val="single" w:sz="2" w:space="0" w:color="000000"/>
               <w:bottom w:val="single" w:sz="2" w:space="0" w:color="000000"/>
@@ -3821,7 +3829,7 @@
         <w:trPr/>
         <w:tc>
           <w:tcPr>
-            <w:tcW w:w="1583" w:type="dxa"/>
+            <w:tcW w:w="1582" w:type="dxa"/>
             <w:tcBorders>
               <w:left w:val="single" w:sz="2" w:space="0" w:color="000000"/>
               <w:bottom w:val="single" w:sz="2" w:space="0" w:color="000000"/>
@@ -3844,7 +3852,7 @@
         </w:tc>
         <w:tc>
           <w:tcPr>
-            <w:tcW w:w="5220" w:type="dxa"/>
+            <w:tcW w:w="5219" w:type="dxa"/>
             <w:tcBorders>
               <w:left w:val="single" w:sz="2" w:space="0" w:color="000000"/>
               <w:bottom w:val="single" w:sz="2" w:space="0" w:color="000000"/>
@@ -3870,7 +3878,7 @@
         </w:tc>
         <w:tc>
           <w:tcPr>
-            <w:tcW w:w="2212" w:type="dxa"/>
+            <w:tcW w:w="2214" w:type="dxa"/>
             <w:tcBorders>
               <w:left w:val="single" w:sz="2" w:space="0" w:color="000000"/>
               <w:bottom w:val="single" w:sz="2" w:space="0" w:color="000000"/>
@@ -3900,7 +3908,7 @@
         <w:trPr/>
         <w:tc>
           <w:tcPr>
-            <w:tcW w:w="1583" w:type="dxa"/>
+            <w:tcW w:w="1582" w:type="dxa"/>
             <w:tcBorders>
               <w:left w:val="single" w:sz="2" w:space="0" w:color="000000"/>
               <w:bottom w:val="single" w:sz="2" w:space="0" w:color="000000"/>
@@ -3923,7 +3931,7 @@
         </w:tc>
         <w:tc>
           <w:tcPr>
-            <w:tcW w:w="5220" w:type="dxa"/>
+            <w:tcW w:w="5219" w:type="dxa"/>
             <w:tcBorders>
               <w:left w:val="single" w:sz="2" w:space="0" w:color="000000"/>
               <w:bottom w:val="single" w:sz="2" w:space="0" w:color="000000"/>
@@ -3949,7 +3957,7 @@
         </w:tc>
         <w:tc>
           <w:tcPr>
-            <w:tcW w:w="2212" w:type="dxa"/>
+            <w:tcW w:w="2214" w:type="dxa"/>
             <w:tcBorders>
               <w:left w:val="single" w:sz="2" w:space="0" w:color="000000"/>
               <w:bottom w:val="single" w:sz="2" w:space="0" w:color="000000"/>
@@ -3979,7 +3987,7 @@
         <w:trPr/>
         <w:tc>
           <w:tcPr>
-            <w:tcW w:w="1583" w:type="dxa"/>
+            <w:tcW w:w="1582" w:type="dxa"/>
             <w:tcBorders>
               <w:left w:val="single" w:sz="2" w:space="0" w:color="000000"/>
               <w:bottom w:val="single" w:sz="2" w:space="0" w:color="000000"/>
@@ -4002,7 +4010,7 @@
         </w:tc>
         <w:tc>
           <w:tcPr>
-            <w:tcW w:w="5220" w:type="dxa"/>
+            <w:tcW w:w="5219" w:type="dxa"/>
             <w:tcBorders>
               <w:left w:val="single" w:sz="2" w:space="0" w:color="000000"/>
               <w:bottom w:val="single" w:sz="2" w:space="0" w:color="000000"/>
@@ -4028,7 +4036,7 @@
         </w:tc>
         <w:tc>
           <w:tcPr>
-            <w:tcW w:w="2212" w:type="dxa"/>
+            <w:tcW w:w="2214" w:type="dxa"/>
             <w:tcBorders>
               <w:left w:val="single" w:sz="2" w:space="0" w:color="000000"/>
               <w:bottom w:val="single" w:sz="2" w:space="0" w:color="000000"/>
@@ -4058,7 +4066,7 @@
         <w:trPr/>
         <w:tc>
           <w:tcPr>
-            <w:tcW w:w="1583" w:type="dxa"/>
+            <w:tcW w:w="1582" w:type="dxa"/>
             <w:tcBorders>
               <w:left w:val="single" w:sz="2" w:space="0" w:color="000000"/>
               <w:bottom w:val="single" w:sz="2" w:space="0" w:color="000000"/>
@@ -4081,7 +4089,7 @@
         </w:tc>
         <w:tc>
           <w:tcPr>
-            <w:tcW w:w="5220" w:type="dxa"/>
+            <w:tcW w:w="5219" w:type="dxa"/>
             <w:tcBorders>
               <w:left w:val="single" w:sz="2" w:space="0" w:color="000000"/>
               <w:bottom w:val="single" w:sz="2" w:space="0" w:color="000000"/>
@@ -4104,7 +4112,7 @@
         </w:tc>
         <w:tc>
           <w:tcPr>
-            <w:tcW w:w="2212" w:type="dxa"/>
+            <w:tcW w:w="2214" w:type="dxa"/>
             <w:tcBorders>
               <w:left w:val="single" w:sz="2" w:space="0" w:color="000000"/>
               <w:bottom w:val="single" w:sz="2" w:space="0" w:color="000000"/>
@@ -4134,7 +4142,7 @@
         <w:trPr/>
         <w:tc>
           <w:tcPr>
-            <w:tcW w:w="1583" w:type="dxa"/>
+            <w:tcW w:w="1582" w:type="dxa"/>
             <w:tcBorders>
               <w:left w:val="single" w:sz="2" w:space="0" w:color="000000"/>
               <w:bottom w:val="single" w:sz="2" w:space="0" w:color="000000"/>
@@ -4164,7 +4172,7 @@
         </w:tc>
         <w:tc>
           <w:tcPr>
-            <w:tcW w:w="5220" w:type="dxa"/>
+            <w:tcW w:w="5219" w:type="dxa"/>
             <w:tcBorders>
               <w:left w:val="single" w:sz="2" w:space="0" w:color="000000"/>
               <w:bottom w:val="single" w:sz="2" w:space="0" w:color="000000"/>
@@ -4194,7 +4202,7 @@
         </w:tc>
         <w:tc>
           <w:tcPr>
-            <w:tcW w:w="2212" w:type="dxa"/>
+            <w:tcW w:w="2214" w:type="dxa"/>
             <w:tcBorders>
               <w:left w:val="single" w:sz="2" w:space="0" w:color="000000"/>
               <w:bottom w:val="single" w:sz="2" w:space="0" w:color="000000"/>
@@ -4228,7 +4236,7 @@
         <w:trPr/>
         <w:tc>
           <w:tcPr>
-            <w:tcW w:w="1583" w:type="dxa"/>
+            <w:tcW w:w="1582" w:type="dxa"/>
             <w:tcBorders>
               <w:left w:val="single" w:sz="2" w:space="0" w:color="000000"/>
               <w:bottom w:val="single" w:sz="2" w:space="0" w:color="000000"/>
@@ -4258,7 +4266,7 @@
         </w:tc>
         <w:tc>
           <w:tcPr>
-            <w:tcW w:w="5220" w:type="dxa"/>
+            <w:tcW w:w="5219" w:type="dxa"/>
             <w:tcBorders>
               <w:left w:val="single" w:sz="2" w:space="0" w:color="000000"/>
               <w:bottom w:val="single" w:sz="2" w:space="0" w:color="000000"/>
@@ -4288,7 +4296,7 @@
         </w:tc>
         <w:tc>
           <w:tcPr>
-            <w:tcW w:w="2212" w:type="dxa"/>
+            <w:tcW w:w="2214" w:type="dxa"/>
             <w:tcBorders>
               <w:left w:val="single" w:sz="2" w:space="0" w:color="000000"/>
               <w:bottom w:val="single" w:sz="2" w:space="0" w:color="000000"/>
@@ -4322,7 +4330,7 @@
         <w:trPr/>
         <w:tc>
           <w:tcPr>
-            <w:tcW w:w="1583" w:type="dxa"/>
+            <w:tcW w:w="1582" w:type="dxa"/>
             <w:tcBorders>
               <w:left w:val="single" w:sz="2" w:space="0" w:color="000000"/>
               <w:bottom w:val="single" w:sz="2" w:space="0" w:color="000000"/>
@@ -4352,7 +4360,7 @@
         </w:tc>
         <w:tc>
           <w:tcPr>
-            <w:tcW w:w="5220" w:type="dxa"/>
+            <w:tcW w:w="5219" w:type="dxa"/>
             <w:tcBorders>
               <w:left w:val="single" w:sz="2" w:space="0" w:color="000000"/>
               <w:bottom w:val="single" w:sz="2" w:space="0" w:color="000000"/>
@@ -4382,7 +4390,7 @@
         </w:tc>
         <w:tc>
           <w:tcPr>
-            <w:tcW w:w="2212" w:type="dxa"/>
+            <w:tcW w:w="2214" w:type="dxa"/>
             <w:tcBorders>
               <w:left w:val="single" w:sz="2" w:space="0" w:color="000000"/>
               <w:bottom w:val="single" w:sz="2" w:space="0" w:color="000000"/>
@@ -4415,7 +4423,7 @@
         <w:trPr/>
         <w:tc>
           <w:tcPr>
-            <w:tcW w:w="1583" w:type="dxa"/>
+            <w:tcW w:w="1582" w:type="dxa"/>
             <w:tcBorders>
               <w:left w:val="single" w:sz="2" w:space="0" w:color="000000"/>
               <w:bottom w:val="single" w:sz="2" w:space="0" w:color="000000"/>
@@ -4438,7 +4446,7 @@
         </w:tc>
         <w:tc>
           <w:tcPr>
-            <w:tcW w:w="5220" w:type="dxa"/>
+            <w:tcW w:w="5219" w:type="dxa"/>
             <w:tcBorders>
               <w:left w:val="single" w:sz="2" w:space="0" w:color="000000"/>
               <w:bottom w:val="single" w:sz="2" w:space="0" w:color="000000"/>
@@ -4464,7 +4472,7 @@
         </w:tc>
         <w:tc>
           <w:tcPr>
-            <w:tcW w:w="2212" w:type="dxa"/>
+            <w:tcW w:w="2214" w:type="dxa"/>
             <w:tcBorders>
               <w:left w:val="single" w:sz="2" w:space="0" w:color="000000"/>
               <w:bottom w:val="single" w:sz="2" w:space="0" w:color="000000"/>
@@ -4494,7 +4502,7 @@
         <w:trPr/>
         <w:tc>
           <w:tcPr>
-            <w:tcW w:w="1583" w:type="dxa"/>
+            <w:tcW w:w="1582" w:type="dxa"/>
             <w:tcBorders>
               <w:left w:val="single" w:sz="2" w:space="0" w:color="000000"/>
               <w:bottom w:val="single" w:sz="2" w:space="0" w:color="000000"/>
@@ -4520,7 +4528,7 @@
         </w:tc>
         <w:tc>
           <w:tcPr>
-            <w:tcW w:w="5220" w:type="dxa"/>
+            <w:tcW w:w="5219" w:type="dxa"/>
             <w:tcBorders>
               <w:left w:val="single" w:sz="2" w:space="0" w:color="000000"/>
               <w:bottom w:val="single" w:sz="2" w:space="0" w:color="000000"/>
@@ -4548,7 +4556,7 @@
         </w:tc>
         <w:tc>
           <w:tcPr>
-            <w:tcW w:w="2212" w:type="dxa"/>
+            <w:tcW w:w="2214" w:type="dxa"/>
             <w:tcBorders>
               <w:left w:val="single" w:sz="2" w:space="0" w:color="000000"/>
               <w:bottom w:val="single" w:sz="2" w:space="0" w:color="000000"/>
@@ -4580,7 +4588,7 @@
         <w:trPr/>
         <w:tc>
           <w:tcPr>
-            <w:tcW w:w="1583" w:type="dxa"/>
+            <w:tcW w:w="1582" w:type="dxa"/>
             <w:tcBorders>
               <w:left w:val="single" w:sz="2" w:space="0" w:color="000000"/>
               <w:bottom w:val="single" w:sz="2" w:space="0" w:color="000000"/>
@@ -4606,7 +4614,7 @@
         </w:tc>
         <w:tc>
           <w:tcPr>
-            <w:tcW w:w="5220" w:type="dxa"/>
+            <w:tcW w:w="5219" w:type="dxa"/>
             <w:tcBorders>
               <w:left w:val="single" w:sz="2" w:space="0" w:color="000000"/>
               <w:bottom w:val="single" w:sz="2" w:space="0" w:color="000000"/>
@@ -4632,7 +4640,7 @@
         </w:tc>
         <w:tc>
           <w:tcPr>
-            <w:tcW w:w="2212" w:type="dxa"/>
+            <w:tcW w:w="2214" w:type="dxa"/>
             <w:tcBorders>
               <w:left w:val="single" w:sz="2" w:space="0" w:color="000000"/>
               <w:bottom w:val="single" w:sz="2" w:space="0" w:color="000000"/>
@@ -4662,7 +4670,7 @@
         <w:trPr/>
         <w:tc>
           <w:tcPr>
-            <w:tcW w:w="1583" w:type="dxa"/>
+            <w:tcW w:w="1582" w:type="dxa"/>
             <w:tcBorders>
               <w:left w:val="single" w:sz="2" w:space="0" w:color="000000"/>
               <w:bottom w:val="single" w:sz="2" w:space="0" w:color="000000"/>
@@ -4688,7 +4696,7 @@
         </w:tc>
         <w:tc>
           <w:tcPr>
-            <w:tcW w:w="5220" w:type="dxa"/>
+            <w:tcW w:w="5219" w:type="dxa"/>
             <w:tcBorders>
               <w:left w:val="single" w:sz="2" w:space="0" w:color="000000"/>
               <w:bottom w:val="single" w:sz="2" w:space="0" w:color="000000"/>
@@ -4716,7 +4724,7 @@
         </w:tc>
         <w:tc>
           <w:tcPr>
-            <w:tcW w:w="2212" w:type="dxa"/>
+            <w:tcW w:w="2214" w:type="dxa"/>
             <w:tcBorders>
               <w:left w:val="single" w:sz="2" w:space="0" w:color="000000"/>
               <w:bottom w:val="single" w:sz="2" w:space="0" w:color="000000"/>
@@ -4746,7 +4754,7 @@
         <w:trPr/>
         <w:tc>
           <w:tcPr>
-            <w:tcW w:w="1583" w:type="dxa"/>
+            <w:tcW w:w="1582" w:type="dxa"/>
             <w:tcBorders>
               <w:left w:val="single" w:sz="2" w:space="0" w:color="000000"/>
               <w:bottom w:val="single" w:sz="2" w:space="0" w:color="000000"/>
@@ -4772,7 +4780,7 @@
         </w:tc>
         <w:tc>
           <w:tcPr>
-            <w:tcW w:w="5220" w:type="dxa"/>
+            <w:tcW w:w="5219" w:type="dxa"/>
             <w:tcBorders>
               <w:left w:val="single" w:sz="2" w:space="0" w:color="000000"/>
               <w:bottom w:val="single" w:sz="2" w:space="0" w:color="000000"/>
@@ -4800,7 +4808,7 @@
         </w:tc>
         <w:tc>
           <w:tcPr>
-            <w:tcW w:w="2212" w:type="dxa"/>
+            <w:tcW w:w="2214" w:type="dxa"/>
             <w:tcBorders>
               <w:left w:val="single" w:sz="2" w:space="0" w:color="000000"/>
               <w:bottom w:val="single" w:sz="2" w:space="0" w:color="000000"/>
@@ -4830,7 +4838,7 @@
         <w:trPr/>
         <w:tc>
           <w:tcPr>
-            <w:tcW w:w="1583" w:type="dxa"/>
+            <w:tcW w:w="1582" w:type="dxa"/>
             <w:tcBorders>
               <w:left w:val="single" w:sz="2" w:space="0" w:color="000000"/>
               <w:bottom w:val="single" w:sz="2" w:space="0" w:color="000000"/>
@@ -4856,7 +4864,7 @@
         </w:tc>
         <w:tc>
           <w:tcPr>
-            <w:tcW w:w="5220" w:type="dxa"/>
+            <w:tcW w:w="5219" w:type="dxa"/>
             <w:tcBorders>
               <w:left w:val="single" w:sz="2" w:space="0" w:color="000000"/>
               <w:bottom w:val="single" w:sz="2" w:space="0" w:color="000000"/>
@@ -4884,7 +4892,7 @@
         </w:tc>
         <w:tc>
           <w:tcPr>
-            <w:tcW w:w="2212" w:type="dxa"/>
+            <w:tcW w:w="2214" w:type="dxa"/>
             <w:tcBorders>
               <w:left w:val="single" w:sz="2" w:space="0" w:color="000000"/>
               <w:bottom w:val="single" w:sz="2" w:space="0" w:color="000000"/>
@@ -4914,7 +4922,7 @@
         <w:trPr/>
         <w:tc>
           <w:tcPr>
-            <w:tcW w:w="1583" w:type="dxa"/>
+            <w:tcW w:w="1582" w:type="dxa"/>
             <w:tcBorders>
               <w:left w:val="single" w:sz="2" w:space="0" w:color="000000"/>
               <w:bottom w:val="single" w:sz="2" w:space="0" w:color="000000"/>
@@ -4940,7 +4948,7 @@
         </w:tc>
         <w:tc>
           <w:tcPr>
-            <w:tcW w:w="5220" w:type="dxa"/>
+            <w:tcW w:w="5219" w:type="dxa"/>
             <w:tcBorders>
               <w:left w:val="single" w:sz="2" w:space="0" w:color="000000"/>
               <w:bottom w:val="single" w:sz="2" w:space="0" w:color="000000"/>
@@ -4966,7 +4974,7 @@
         </w:tc>
         <w:tc>
           <w:tcPr>
-            <w:tcW w:w="2212" w:type="dxa"/>
+            <w:tcW w:w="2214" w:type="dxa"/>
             <w:tcBorders>
               <w:left w:val="single" w:sz="2" w:space="0" w:color="000000"/>
               <w:bottom w:val="single" w:sz="2" w:space="0" w:color="000000"/>
@@ -4996,7 +5004,7 @@
         <w:trPr/>
         <w:tc>
           <w:tcPr>
-            <w:tcW w:w="1583" w:type="dxa"/>
+            <w:tcW w:w="1582" w:type="dxa"/>
             <w:tcBorders>
               <w:left w:val="single" w:sz="2" w:space="0" w:color="000000"/>
               <w:bottom w:val="single" w:sz="2" w:space="0" w:color="000000"/>
@@ -5022,7 +5030,7 @@
         </w:tc>
         <w:tc>
           <w:tcPr>
-            <w:tcW w:w="5220" w:type="dxa"/>
+            <w:tcW w:w="5219" w:type="dxa"/>
             <w:tcBorders>
               <w:left w:val="single" w:sz="2" w:space="0" w:color="000000"/>
               <w:bottom w:val="single" w:sz="2" w:space="0" w:color="000000"/>
@@ -5048,7 +5056,7 @@
         </w:tc>
         <w:tc>
           <w:tcPr>
-            <w:tcW w:w="2212" w:type="dxa"/>
+            <w:tcW w:w="2214" w:type="dxa"/>
             <w:tcBorders>
               <w:left w:val="single" w:sz="2" w:space="0" w:color="000000"/>
               <w:bottom w:val="single" w:sz="2" w:space="0" w:color="000000"/>
@@ -5078,7 +5086,7 @@
         <w:trPr/>
         <w:tc>
           <w:tcPr>
-            <w:tcW w:w="1583" w:type="dxa"/>
+            <w:tcW w:w="1582" w:type="dxa"/>
             <w:tcBorders>
               <w:left w:val="single" w:sz="2" w:space="0" w:color="000000"/>
               <w:bottom w:val="single" w:sz="2" w:space="0" w:color="000000"/>
@@ -5104,7 +5112,7 @@
         </w:tc>
         <w:tc>
           <w:tcPr>
-            <w:tcW w:w="5220" w:type="dxa"/>
+            <w:tcW w:w="5219" w:type="dxa"/>
             <w:tcBorders>
               <w:left w:val="single" w:sz="2" w:space="0" w:color="000000"/>
               <w:bottom w:val="single" w:sz="2" w:space="0" w:color="000000"/>
@@ -5131,7 +5139,7 @@
         </w:tc>
         <w:tc>
           <w:tcPr>
-            <w:tcW w:w="2212" w:type="dxa"/>
+            <w:tcW w:w="2214" w:type="dxa"/>
             <w:tcBorders>
               <w:left w:val="single" w:sz="2" w:space="0" w:color="000000"/>
               <w:bottom w:val="single" w:sz="2" w:space="0" w:color="000000"/>
@@ -5161,7 +5169,7 @@
         <w:trPr/>
         <w:tc>
           <w:tcPr>
-            <w:tcW w:w="1583" w:type="dxa"/>
+            <w:tcW w:w="1582" w:type="dxa"/>
             <w:tcBorders>
               <w:left w:val="single" w:sz="2" w:space="0" w:color="000000"/>
               <w:bottom w:val="single" w:sz="2" w:space="0" w:color="000000"/>
@@ -5187,7 +5195,7 @@
         </w:tc>
         <w:tc>
           <w:tcPr>
-            <w:tcW w:w="5220" w:type="dxa"/>
+            <w:tcW w:w="5219" w:type="dxa"/>
             <w:tcBorders>
               <w:left w:val="single" w:sz="2" w:space="0" w:color="000000"/>
               <w:bottom w:val="single" w:sz="2" w:space="0" w:color="000000"/>
@@ -5214,7 +5222,7 @@
         </w:tc>
         <w:tc>
           <w:tcPr>
-            <w:tcW w:w="2212" w:type="dxa"/>
+            <w:tcW w:w="2214" w:type="dxa"/>
             <w:tcBorders>
               <w:left w:val="single" w:sz="2" w:space="0" w:color="000000"/>
               <w:bottom w:val="single" w:sz="2" w:space="0" w:color="000000"/>
@@ -5244,7 +5252,7 @@
         <w:trPr/>
         <w:tc>
           <w:tcPr>
-            <w:tcW w:w="1583" w:type="dxa"/>
+            <w:tcW w:w="1582" w:type="dxa"/>
             <w:tcBorders>
               <w:left w:val="single" w:sz="2" w:space="0" w:color="000000"/>
               <w:bottom w:val="single" w:sz="2" w:space="0" w:color="000000"/>
@@ -5270,7 +5278,7 @@
         </w:tc>
         <w:tc>
           <w:tcPr>
-            <w:tcW w:w="5220" w:type="dxa"/>
+            <w:tcW w:w="5219" w:type="dxa"/>
             <w:tcBorders>
               <w:left w:val="single" w:sz="2" w:space="0" w:color="000000"/>
               <w:bottom w:val="single" w:sz="2" w:space="0" w:color="000000"/>
@@ -5297,7 +5305,7 @@
         </w:tc>
         <w:tc>
           <w:tcPr>
-            <w:tcW w:w="2212" w:type="dxa"/>
+            <w:tcW w:w="2214" w:type="dxa"/>
             <w:tcBorders>
               <w:left w:val="single" w:sz="2" w:space="0" w:color="000000"/>
               <w:bottom w:val="single" w:sz="2" w:space="0" w:color="000000"/>
@@ -5327,7 +5335,7 @@
         <w:trPr/>
         <w:tc>
           <w:tcPr>
-            <w:tcW w:w="1583" w:type="dxa"/>
+            <w:tcW w:w="1582" w:type="dxa"/>
             <w:tcBorders>
               <w:left w:val="single" w:sz="2" w:space="0" w:color="000000"/>
               <w:bottom w:val="single" w:sz="2" w:space="0" w:color="000000"/>
@@ -5353,7 +5361,7 @@
         </w:tc>
         <w:tc>
           <w:tcPr>
-            <w:tcW w:w="5220" w:type="dxa"/>
+            <w:tcW w:w="5219" w:type="dxa"/>
             <w:tcBorders>
               <w:left w:val="single" w:sz="2" w:space="0" w:color="000000"/>
               <w:bottom w:val="single" w:sz="2" w:space="0" w:color="000000"/>
@@ -5379,7 +5387,7 @@
         </w:tc>
         <w:tc>
           <w:tcPr>
-            <w:tcW w:w="2212" w:type="dxa"/>
+            <w:tcW w:w="2214" w:type="dxa"/>
             <w:tcBorders>
               <w:left w:val="single" w:sz="2" w:space="0" w:color="000000"/>
               <w:bottom w:val="single" w:sz="2" w:space="0" w:color="000000"/>
@@ -5409,7 +5417,7 @@
         <w:trPr/>
         <w:tc>
           <w:tcPr>
-            <w:tcW w:w="1583" w:type="dxa"/>
+            <w:tcW w:w="1582" w:type="dxa"/>
             <w:tcBorders>
               <w:left w:val="single" w:sz="2" w:space="0" w:color="000000"/>
               <w:bottom w:val="single" w:sz="2" w:space="0" w:color="000000"/>
@@ -5436,7 +5444,7 @@
         </w:tc>
         <w:tc>
           <w:tcPr>
-            <w:tcW w:w="5220" w:type="dxa"/>
+            <w:tcW w:w="5219" w:type="dxa"/>
             <w:tcBorders>
               <w:left w:val="single" w:sz="2" w:space="0" w:color="000000"/>
               <w:bottom w:val="single" w:sz="2" w:space="0" w:color="000000"/>
@@ -5464,7 +5472,7 @@
         </w:tc>
         <w:tc>
           <w:tcPr>
-            <w:tcW w:w="2212" w:type="dxa"/>
+            <w:tcW w:w="2214" w:type="dxa"/>
             <w:tcBorders>
               <w:left w:val="single" w:sz="2" w:space="0" w:color="000000"/>
               <w:bottom w:val="single" w:sz="2" w:space="0" w:color="000000"/>
@@ -5494,7 +5502,7 @@
         <w:trPr/>
         <w:tc>
           <w:tcPr>
-            <w:tcW w:w="1583" w:type="dxa"/>
+            <w:tcW w:w="1582" w:type="dxa"/>
             <w:tcBorders>
               <w:left w:val="single" w:sz="2" w:space="0" w:color="000000"/>
               <w:bottom w:val="single" w:sz="2" w:space="0" w:color="000000"/>
@@ -5522,7 +5530,7 @@
         </w:tc>
         <w:tc>
           <w:tcPr>
-            <w:tcW w:w="5220" w:type="dxa"/>
+            <w:tcW w:w="5219" w:type="dxa"/>
             <w:tcBorders>
               <w:left w:val="single" w:sz="2" w:space="0" w:color="000000"/>
               <w:bottom w:val="single" w:sz="2" w:space="0" w:color="000000"/>
@@ -5550,7 +5558,7 @@
         </w:tc>
         <w:tc>
           <w:tcPr>
-            <w:tcW w:w="2212" w:type="dxa"/>
+            <w:tcW w:w="2214" w:type="dxa"/>
             <w:tcBorders>
               <w:left w:val="single" w:sz="2" w:space="0" w:color="000000"/>
               <w:bottom w:val="single" w:sz="2" w:space="0" w:color="000000"/>
@@ -5580,7 +5588,7 @@
         <w:trPr/>
         <w:tc>
           <w:tcPr>
-            <w:tcW w:w="1583" w:type="dxa"/>
+            <w:tcW w:w="1582" w:type="dxa"/>
             <w:tcBorders>
               <w:left w:val="single" w:sz="2" w:space="0" w:color="000000"/>
               <w:bottom w:val="single" w:sz="2" w:space="0" w:color="000000"/>
@@ -5608,7 +5616,7 @@
         </w:tc>
         <w:tc>
           <w:tcPr>
-            <w:tcW w:w="5220" w:type="dxa"/>
+            <w:tcW w:w="5219" w:type="dxa"/>
             <w:tcBorders>
               <w:left w:val="single" w:sz="2" w:space="0" w:color="000000"/>
               <w:bottom w:val="single" w:sz="2" w:space="0" w:color="000000"/>
@@ -5636,7 +5644,7 @@
         </w:tc>
         <w:tc>
           <w:tcPr>
-            <w:tcW w:w="2212" w:type="dxa"/>
+            <w:tcW w:w="2214" w:type="dxa"/>
             <w:tcBorders>
               <w:left w:val="single" w:sz="2" w:space="0" w:color="000000"/>
               <w:bottom w:val="single" w:sz="2" w:space="0" w:color="000000"/>
@@ -5668,7 +5676,7 @@
         <w:trPr/>
         <w:tc>
           <w:tcPr>
-            <w:tcW w:w="1583" w:type="dxa"/>
+            <w:tcW w:w="1582" w:type="dxa"/>
             <w:tcBorders>
               <w:left w:val="single" w:sz="2" w:space="0" w:color="000000"/>
               <w:bottom w:val="single" w:sz="2" w:space="0" w:color="000000"/>
@@ -5694,7 +5702,7 @@
         </w:tc>
         <w:tc>
           <w:tcPr>
-            <w:tcW w:w="5220" w:type="dxa"/>
+            <w:tcW w:w="5219" w:type="dxa"/>
             <w:tcBorders>
               <w:left w:val="single" w:sz="2" w:space="0" w:color="000000"/>
               <w:bottom w:val="single" w:sz="2" w:space="0" w:color="000000"/>
@@ -5721,7 +5729,7 @@
         </w:tc>
         <w:tc>
           <w:tcPr>
-            <w:tcW w:w="2212" w:type="dxa"/>
+            <w:tcW w:w="2214" w:type="dxa"/>
             <w:tcBorders>
               <w:left w:val="single" w:sz="2" w:space="0" w:color="000000"/>
               <w:bottom w:val="single" w:sz="2" w:space="0" w:color="000000"/>
@@ -5757,7 +5765,7 @@
         <w:trPr/>
         <w:tc>
           <w:tcPr>
-            <w:tcW w:w="1583" w:type="dxa"/>
+            <w:tcW w:w="1582" w:type="dxa"/>
             <w:tcBorders>
               <w:left w:val="single" w:sz="2" w:space="0" w:color="000000"/>
               <w:bottom w:val="single" w:sz="2" w:space="0" w:color="000000"/>
@@ -5783,7 +5791,7 @@
         </w:tc>
         <w:tc>
           <w:tcPr>
-            <w:tcW w:w="5220" w:type="dxa"/>
+            <w:tcW w:w="5219" w:type="dxa"/>
             <w:tcBorders>
               <w:left w:val="single" w:sz="2" w:space="0" w:color="000000"/>
               <w:bottom w:val="single" w:sz="2" w:space="0" w:color="000000"/>
@@ -5811,7 +5819,7 @@
         </w:tc>
         <w:tc>
           <w:tcPr>
-            <w:tcW w:w="2212" w:type="dxa"/>
+            <w:tcW w:w="2214" w:type="dxa"/>
             <w:tcBorders>
               <w:left w:val="single" w:sz="2" w:space="0" w:color="000000"/>
               <w:bottom w:val="single" w:sz="2" w:space="0" w:color="000000"/>
@@ -5847,7 +5855,7 @@
         <w:trPr/>
         <w:tc>
           <w:tcPr>
-            <w:tcW w:w="1583" w:type="dxa"/>
+            <w:tcW w:w="1582" w:type="dxa"/>
             <w:tcBorders>
               <w:left w:val="single" w:sz="2" w:space="0" w:color="000000"/>
               <w:bottom w:val="single" w:sz="2" w:space="0" w:color="000000"/>
@@ -5877,7 +5885,7 @@
         </w:tc>
         <w:tc>
           <w:tcPr>
-            <w:tcW w:w="5220" w:type="dxa"/>
+            <w:tcW w:w="5219" w:type="dxa"/>
             <w:tcBorders>
               <w:left w:val="single" w:sz="2" w:space="0" w:color="000000"/>
               <w:bottom w:val="single" w:sz="2" w:space="0" w:color="000000"/>
@@ -5905,7 +5913,7 @@
         </w:tc>
         <w:tc>
           <w:tcPr>
-            <w:tcW w:w="2212" w:type="dxa"/>
+            <w:tcW w:w="2214" w:type="dxa"/>
             <w:tcBorders>
               <w:left w:val="single" w:sz="2" w:space="0" w:color="000000"/>
               <w:bottom w:val="single" w:sz="2" w:space="0" w:color="000000"/>
@@ -5942,7 +5950,7 @@
         <w:trPr/>
         <w:tc>
           <w:tcPr>
-            <w:tcW w:w="1583" w:type="dxa"/>
+            <w:tcW w:w="1582" w:type="dxa"/>
             <w:tcBorders>
               <w:left w:val="single" w:sz="2" w:space="0" w:color="000000"/>
               <w:bottom w:val="single" w:sz="2" w:space="0" w:color="000000"/>
@@ -5953,26 +5961,23 @@
             <w:pPr>
               <w:pStyle w:val="Tabelindhold"/>
               <w:rPr>
+                <w:color w:val="C9211E"/>
+              </w:rPr>
+            </w:pPr>
+            <w:r>
+              <w:rPr>
                 <w:rFonts w:ascii="Verdana" w:hAnsi="Verdana"/>
-                <w:color w:val="000000"/>
+                <w:color w:val="C9211E"/>
                 <w:sz w:val="22"/>
                 <w:szCs w:val="22"/>
               </w:rPr>
-            </w:pPr>
-            <w:r>
-              <w:rPr>
-                <w:rFonts w:ascii="Verdana" w:hAnsi="Verdana"/>
-                <w:color w:val="000000"/>
-                <w:sz w:val="22"/>
-                <w:szCs w:val="22"/>
-              </w:rPr>
               <w:t>Instellingen</w:t>
             </w:r>
           </w:p>
         </w:tc>
         <w:tc>
           <w:tcPr>
-            <w:tcW w:w="5220" w:type="dxa"/>
+            <w:tcW w:w="5219" w:type="dxa"/>
             <w:tcBorders>
               <w:left w:val="single" w:sz="2" w:space="0" w:color="000000"/>
               <w:bottom w:val="single" w:sz="2" w:space="0" w:color="000000"/>
@@ -5983,24 +5988,41 @@
             <w:pPr>
               <w:pStyle w:val="Tabelindhold"/>
               <w:rPr>
-                <w:rFonts w:ascii="Verdana" w:hAnsi="Verdana" w:cs="Verdana"/>
+                <w:color w:val="C9211E"/>
+              </w:rPr>
+            </w:pPr>
+            <w:r>
+              <w:rPr>
+                <w:rFonts w:cs="Verdana" w:ascii="Verdana" w:hAnsi="Verdana"/>
+                <w:color w:val="C9211E"/>
                 <w:sz w:val="22"/>
                 <w:lang w:val="da-DK"/>
               </w:rPr>
-            </w:pPr>
-            <w:r>
-              <w:rPr>
-                <w:rFonts w:cs="Verdana" w:ascii="Verdana" w:hAnsi="Verdana"/>
+              <w:t xml:space="preserve">Instellingen voor braille </w:t>
+            </w:r>
+            <w:r>
+              <w:rPr>
+                <w:rFonts w:cs="Verdana" w:ascii="Verdana" w:hAnsi="Verdana"/>
+                <w:color w:val="C9211E"/>
                 <w:sz w:val="22"/>
                 <w:lang w:val="da-DK"/>
               </w:rPr>
-              <w:t>Insetllingen voor algemene braille printer profiel</w:t>
-            </w:r>
-          </w:p>
-        </w:tc>
-        <w:tc>
-          <w:tcPr>
-            <w:tcW w:w="2212" w:type="dxa"/>
+              <w:t xml:space="preserve">high speed </w:t>
+            </w:r>
+            <w:r>
+              <w:rPr>
+                <w:rFonts w:cs="Verdana" w:ascii="Verdana" w:hAnsi="Verdana"/>
+                <w:color w:val="C9211E"/>
+                <w:sz w:val="22"/>
+                <w:lang w:val="da-DK"/>
+              </w:rPr>
+              <w:t>printer profiel</w:t>
+            </w:r>
+          </w:p>
+        </w:tc>
+        <w:tc>
+          <w:tcPr>
+            <w:tcW w:w="2214" w:type="dxa"/>
             <w:tcBorders>
               <w:left w:val="single" w:sz="2" w:space="0" w:color="000000"/>
               <w:bottom w:val="single" w:sz="2" w:space="0" w:color="000000"/>
@@ -6013,22 +6035,18 @@
               <w:pStyle w:val="Tabelindhold"/>
               <w:snapToGrid w:val="false"/>
               <w:rPr>
-                <w:rFonts w:ascii="Verdana" w:hAnsi="Verdana" w:cs="Verdana"/>
-                <w:color w:val="000000"/>
+                <w:color w:val="C9211E"/>
+              </w:rPr>
+            </w:pPr>
+            <w:r>
+              <w:rPr>
+                <w:rFonts w:cs="Verdana" w:ascii="Verdana" w:hAnsi="Verdana"/>
+                <w:color w:val="C9211E"/>
                 <w:sz w:val="22"/>
                 <w:szCs w:val="22"/>
                 <w:lang w:val="en-US"/>
               </w:rPr>
-            </w:pPr>
-            <w:r>
-              <w:rPr>
-                <w:rFonts w:cs="Verdana" w:ascii="Verdana" w:hAnsi="Verdana"/>
-                <w:color w:val="000000"/>
-                <w:sz w:val="22"/>
-                <w:szCs w:val="22"/>
-                <w:lang w:val="en-US"/>
-              </w:rPr>
-              <w:t>ALT + S + U</w:t>
+              <w:t>ALT + S + H</w:t>
             </w:r>
           </w:p>
         </w:tc>
@@ -6037,7 +6055,7 @@
         <w:trPr/>
         <w:tc>
           <w:tcPr>
-            <w:tcW w:w="1583" w:type="dxa"/>
+            <w:tcW w:w="1582" w:type="dxa"/>
             <w:tcBorders>
               <w:left w:val="single" w:sz="2" w:space="0" w:color="000000"/>
               <w:bottom w:val="single" w:sz="2" w:space="0" w:color="000000"/>
@@ -6067,7 +6085,7 @@
         </w:tc>
         <w:tc>
           <w:tcPr>
-            <w:tcW w:w="5220" w:type="dxa"/>
+            <w:tcW w:w="5219" w:type="dxa"/>
             <w:tcBorders>
               <w:left w:val="single" w:sz="2" w:space="0" w:color="000000"/>
               <w:bottom w:val="single" w:sz="2" w:space="0" w:color="000000"/>
@@ -6089,13 +6107,13 @@
                 <w:sz w:val="22"/>
                 <w:lang w:val="da-DK"/>
               </w:rPr>
-              <w:t>Zet alle instellingen naar standaardwaarden</w:t>
-            </w:r>
-          </w:p>
-        </w:tc>
-        <w:tc>
-          <w:tcPr>
-            <w:tcW w:w="2212" w:type="dxa"/>
+              <w:t>Insetllingen voor algemene braille printer profiel</w:t>
+            </w:r>
+          </w:p>
+        </w:tc>
+        <w:tc>
+          <w:tcPr>
+            <w:tcW w:w="2214" w:type="dxa"/>
             <w:tcBorders>
               <w:left w:val="single" w:sz="2" w:space="0" w:color="000000"/>
               <w:bottom w:val="single" w:sz="2" w:space="0" w:color="000000"/>
@@ -6123,7 +6141,7 @@
                 <w:szCs w:val="22"/>
                 <w:lang w:val="en-US"/>
               </w:rPr>
-              <w:t>ALT + S + R</w:t>
+              <w:t>ALT + S + U</w:t>
             </w:r>
           </w:p>
         </w:tc>
@@ -6132,7 +6150,7 @@
         <w:trPr/>
         <w:tc>
           <w:tcPr>
-            <w:tcW w:w="1583" w:type="dxa"/>
+            <w:tcW w:w="1582" w:type="dxa"/>
             <w:tcBorders>
               <w:left w:val="single" w:sz="2" w:space="0" w:color="000000"/>
               <w:bottom w:val="single" w:sz="2" w:space="0" w:color="000000"/>
@@ -6143,22 +6161,26 @@
             <w:pPr>
               <w:pStyle w:val="Tabelindhold"/>
               <w:rPr>
-                <w:rFonts w:ascii="Verdana" w:hAnsi="Verdana" w:cs="Verdana"/>
-                <w:sz w:val="22"/>
-              </w:rPr>
-            </w:pPr>
-            <w:r>
-              <w:rPr>
-                <w:rFonts w:cs="Verdana" w:ascii="Verdana" w:hAnsi="Verdana"/>
-                <w:sz w:val="22"/>
-              </w:rPr>
-              <w:t>Tools</w:t>
-            </w:r>
-          </w:p>
-        </w:tc>
-        <w:tc>
-          <w:tcPr>
-            <w:tcW w:w="5220" w:type="dxa"/>
+                <w:rFonts w:ascii="Verdana" w:hAnsi="Verdana"/>
+                <w:color w:val="000000"/>
+                <w:sz w:val="22"/>
+                <w:szCs w:val="22"/>
+              </w:rPr>
+            </w:pPr>
+            <w:r>
+              <w:rPr>
+                <w:rFonts w:ascii="Verdana" w:hAnsi="Verdana"/>
+                <w:color w:val="000000"/>
+                <w:sz w:val="22"/>
+                <w:szCs w:val="22"/>
+              </w:rPr>
+              <w:t>Instellingen</w:t>
+            </w:r>
+          </w:p>
+        </w:tc>
+        <w:tc>
+          <w:tcPr>
+            <w:tcW w:w="5219" w:type="dxa"/>
             <w:tcBorders>
               <w:left w:val="single" w:sz="2" w:space="0" w:color="000000"/>
               <w:bottom w:val="single" w:sz="2" w:space="0" w:color="000000"/>
@@ -6171,22 +6193,22 @@
               <w:rPr>
                 <w:rFonts w:ascii="Verdana" w:hAnsi="Verdana" w:cs="Verdana"/>
                 <w:sz w:val="22"/>
-                <w:lang w:val="en-US"/>
-              </w:rPr>
-            </w:pPr>
-            <w:r>
-              <w:rPr>
-                <w:rFonts w:cs="Verdana" w:ascii="Verdana" w:hAnsi="Verdana"/>
-                <w:sz w:val="22"/>
-                <w:lang w:val="en-US"/>
-              </w:rPr>
-              <w:t>Start MuseScore met huidige muziek XML bestand</w:t>
-            </w:r>
-          </w:p>
-        </w:tc>
-        <w:tc>
-          <w:tcPr>
-            <w:tcW w:w="2212" w:type="dxa"/>
+                <w:lang w:val="da-DK"/>
+              </w:rPr>
+            </w:pPr>
+            <w:r>
+              <w:rPr>
+                <w:rFonts w:cs="Verdana" w:ascii="Verdana" w:hAnsi="Verdana"/>
+                <w:sz w:val="22"/>
+                <w:lang w:val="da-DK"/>
+              </w:rPr>
+              <w:t>Zet alle instellingen naar standaardwaarden</w:t>
+            </w:r>
+          </w:p>
+        </w:tc>
+        <w:tc>
+          <w:tcPr>
+            <w:tcW w:w="2214" w:type="dxa"/>
             <w:tcBorders>
               <w:left w:val="single" w:sz="2" w:space="0" w:color="000000"/>
               <w:bottom w:val="single" w:sz="2" w:space="0" w:color="000000"/>
@@ -6199,7 +6221,11 @@
               <w:pStyle w:val="Tabelindhold"/>
               <w:snapToGrid w:val="false"/>
               <w:rPr>
+                <w:rFonts w:ascii="Verdana" w:hAnsi="Verdana" w:cs="Verdana"/>
                 <w:color w:val="000000"/>
+                <w:sz w:val="22"/>
+                <w:szCs w:val="22"/>
+                <w:lang w:val="en-US"/>
               </w:rPr>
             </w:pPr>
             <w:r>
@@ -6207,9 +6233,10 @@
                 <w:rFonts w:cs="Verdana" w:ascii="Verdana" w:hAnsi="Verdana"/>
                 <w:color w:val="000000"/>
                 <w:sz w:val="22"/>
+                <w:szCs w:val="22"/>
                 <w:lang w:val="en-US"/>
               </w:rPr>
-              <w:t>ALT + K + M</w:t>
+              <w:t>ALT + S + R</w:t>
             </w:r>
           </w:p>
         </w:tc>
@@ -6218,7 +6245,7 @@
         <w:trPr/>
         <w:tc>
           <w:tcPr>
-            <w:tcW w:w="1583" w:type="dxa"/>
+            <w:tcW w:w="1582" w:type="dxa"/>
             <w:tcBorders>
               <w:left w:val="single" w:sz="2" w:space="0" w:color="000000"/>
               <w:bottom w:val="single" w:sz="2" w:space="0" w:color="000000"/>
@@ -6228,15 +6255,12 @@
           <w:p>
             <w:pPr>
               <w:pStyle w:val="Tabelindhold"/>
-              <w:rPr>
-                <w:rFonts w:ascii="Verdana" w:hAnsi="Verdana" w:cs="Verdana"/>
-                <w:sz w:val="22"/>
-                <w:lang w:val="da-DK"/>
-              </w:rPr>
-            </w:pPr>
-            <w:r>
-              <w:rPr>
-                <w:rFonts w:cs="Verdana" w:ascii="Verdana" w:hAnsi="Verdana"/>
+              <w:rPr/>
+            </w:pPr>
+            <w:r>
+              <w:rPr>
+                <w:rFonts w:cs="Verdana" w:ascii="Verdana" w:hAnsi="Verdana"/>
+                <w:color w:val="C9211E"/>
                 <w:sz w:val="22"/>
               </w:rPr>
               <w:t>Tools</w:t>
@@ -6245,7 +6269,7 @@
         </w:tc>
         <w:tc>
           <w:tcPr>
-            <w:tcW w:w="5220" w:type="dxa"/>
+            <w:tcW w:w="5219" w:type="dxa"/>
             <w:tcBorders>
               <w:left w:val="single" w:sz="2" w:space="0" w:color="000000"/>
               <w:bottom w:val="single" w:sz="2" w:space="0" w:color="000000"/>
@@ -6255,25 +6279,22 @@
           <w:p>
             <w:pPr>
               <w:pStyle w:val="Tabelindhold"/>
-              <w:rPr>
-                <w:rFonts w:ascii="Verdana" w:hAnsi="Verdana" w:cs="Verdana"/>
+              <w:rPr/>
+            </w:pPr>
+            <w:r>
+              <w:rPr>
+                <w:rFonts w:cs="Verdana" w:ascii="Verdana" w:hAnsi="Verdana"/>
+                <w:color w:val="C9211E"/>
                 <w:sz w:val="22"/>
                 <w:lang w:val="en-US"/>
               </w:rPr>
-            </w:pPr>
-            <w:r>
-              <w:rPr>
-                <w:rFonts w:cs="Verdana" w:ascii="Verdana" w:hAnsi="Verdana"/>
-                <w:sz w:val="22"/>
-                <w:lang w:val="en-US"/>
-              </w:rPr>
-              <w:t xml:space="preserve">Start Sibelius met huidige muziek XML bestand </w:t>
-            </w:r>
-          </w:p>
-        </w:tc>
-        <w:tc>
-          <w:tcPr>
-            <w:tcW w:w="2212" w:type="dxa"/>
+              <w:t>Start IBOS Music Braille Reader</w:t>
+            </w:r>
+          </w:p>
+        </w:tc>
+        <w:tc>
+          <w:tcPr>
+            <w:tcW w:w="2214" w:type="dxa"/>
             <w:tcBorders>
               <w:left w:val="single" w:sz="2" w:space="0" w:color="000000"/>
               <w:bottom w:val="single" w:sz="2" w:space="0" w:color="000000"/>
@@ -6285,18 +6306,16 @@
             <w:pPr>
               <w:pStyle w:val="Tabelindhold"/>
               <w:snapToGrid w:val="false"/>
-              <w:rPr>
-                <w:color w:val="000000"/>
-              </w:rPr>
-            </w:pPr>
-            <w:r>
-              <w:rPr>
-                <w:rFonts w:cs="Verdana" w:ascii="Verdana" w:hAnsi="Verdana"/>
-                <w:color w:val="000000"/>
+              <w:rPr/>
+            </w:pPr>
+            <w:r>
+              <w:rPr>
+                <w:rFonts w:cs="Verdana" w:ascii="Verdana" w:hAnsi="Verdana"/>
+                <w:color w:val="C9211E"/>
                 <w:sz w:val="22"/>
                 <w:lang w:val="en-US"/>
               </w:rPr>
-              <w:t>ALT + K + S</w:t>
+              <w:t>ALT + T + I</w:t>
             </w:r>
           </w:p>
         </w:tc>
@@ -6305,7 +6324,7 @@
         <w:trPr/>
         <w:tc>
           <w:tcPr>
-            <w:tcW w:w="1583" w:type="dxa"/>
+            <w:tcW w:w="1582" w:type="dxa"/>
             <w:tcBorders>
               <w:left w:val="single" w:sz="2" w:space="0" w:color="000000"/>
               <w:bottom w:val="single" w:sz="2" w:space="0" w:color="000000"/>
@@ -6315,17 +6334,23 @@
           <w:p>
             <w:pPr>
               <w:pStyle w:val="Tabelindhold"/>
-              <w:rPr/>
-            </w:pPr>
-            <w:r>
-              <w:rPr/>
+              <w:rPr>
+                <w:rFonts w:ascii="Verdana" w:hAnsi="Verdana" w:cs="Verdana"/>
+                <w:sz w:val="22"/>
+              </w:rPr>
+            </w:pPr>
+            <w:r>
+              <w:rPr>
+                <w:rFonts w:cs="Verdana" w:ascii="Verdana" w:hAnsi="Verdana"/>
+                <w:sz w:val="22"/>
+              </w:rPr>
               <w:t>Tools</w:t>
             </w:r>
           </w:p>
         </w:tc>
         <w:tc>
           <w:tcPr>
-            <w:tcW w:w="5220" w:type="dxa"/>
+            <w:tcW w:w="5219" w:type="dxa"/>
             <w:tcBorders>
               <w:left w:val="single" w:sz="2" w:space="0" w:color="000000"/>
               <w:bottom w:val="single" w:sz="2" w:space="0" w:color="000000"/>
@@ -6335,21 +6360,25 @@
           <w:p>
             <w:pPr>
               <w:pStyle w:val="Tabelindhold"/>
-              <w:rPr/>
-            </w:pPr>
-            <w:r>
-              <w:rPr>
-                <w:rFonts w:cs="Verdana" w:ascii="Verdana" w:hAnsi="Verdana"/>
+              <w:rPr>
+                <w:rFonts w:ascii="Verdana" w:hAnsi="Verdana" w:cs="Verdana"/>
                 <w:sz w:val="22"/>
                 <w:lang w:val="en-US"/>
               </w:rPr>
-              <w:t xml:space="preserve">Start Capella met huidige muziek XML bestand </w:t>
-            </w:r>
-          </w:p>
-        </w:tc>
-        <w:tc>
-          <w:tcPr>
-            <w:tcW w:w="2212" w:type="dxa"/>
+            </w:pPr>
+            <w:r>
+              <w:rPr>
+                <w:rFonts w:cs="Verdana" w:ascii="Verdana" w:hAnsi="Verdana"/>
+                <w:sz w:val="22"/>
+                <w:lang w:val="en-US"/>
+              </w:rPr>
+              <w:t>Start MuseScore met huidige muziek XML bestand</w:t>
+            </w:r>
+          </w:p>
+        </w:tc>
+        <w:tc>
+          <w:tcPr>
+            <w:tcW w:w="2214" w:type="dxa"/>
             <w:tcBorders>
               <w:left w:val="single" w:sz="2" w:space="0" w:color="000000"/>
               <w:bottom w:val="single" w:sz="2" w:space="0" w:color="000000"/>
@@ -6372,7 +6401,7 @@
                 <w:sz w:val="22"/>
                 <w:lang w:val="en-US"/>
               </w:rPr>
-              <w:t>ALT + K + C</w:t>
+              <w:t>ALT + K + M</w:t>
             </w:r>
           </w:p>
         </w:tc>
@@ -6381,7 +6410,7 @@
         <w:trPr/>
         <w:tc>
           <w:tcPr>
-            <w:tcW w:w="1583" w:type="dxa"/>
+            <w:tcW w:w="1582" w:type="dxa"/>
             <w:tcBorders>
               <w:left w:val="single" w:sz="2" w:space="0" w:color="000000"/>
               <w:bottom w:val="single" w:sz="2" w:space="0" w:color="000000"/>
@@ -6391,17 +6420,24 @@
           <w:p>
             <w:pPr>
               <w:pStyle w:val="Tabelindhold"/>
-              <w:rPr/>
-            </w:pPr>
-            <w:r>
-              <w:rPr/>
+              <w:rPr>
+                <w:rFonts w:ascii="Verdana" w:hAnsi="Verdana" w:cs="Verdana"/>
+                <w:sz w:val="22"/>
+                <w:lang w:val="da-DK"/>
+              </w:rPr>
+            </w:pPr>
+            <w:r>
+              <w:rPr>
+                <w:rFonts w:cs="Verdana" w:ascii="Verdana" w:hAnsi="Verdana"/>
+                <w:sz w:val="22"/>
+              </w:rPr>
               <w:t>Tools</w:t>
             </w:r>
           </w:p>
         </w:tc>
         <w:tc>
           <w:tcPr>
-            <w:tcW w:w="5220" w:type="dxa"/>
+            <w:tcW w:w="5219" w:type="dxa"/>
             <w:tcBorders>
               <w:left w:val="single" w:sz="2" w:space="0" w:color="000000"/>
               <w:bottom w:val="single" w:sz="2" w:space="0" w:color="000000"/>
@@ -6411,21 +6447,25 @@
           <w:p>
             <w:pPr>
               <w:pStyle w:val="Tabelindhold"/>
-              <w:rPr/>
-            </w:pPr>
-            <w:r>
-              <w:rPr>
-                <w:rFonts w:cs="Verdana" w:ascii="Verdana" w:hAnsi="Verdana"/>
+              <w:rPr>
+                <w:rFonts w:ascii="Verdana" w:hAnsi="Verdana" w:cs="Verdana"/>
                 <w:sz w:val="22"/>
                 <w:lang w:val="en-US"/>
               </w:rPr>
-              <w:t xml:space="preserve">Start Finale met huidige muziek XML bestand </w:t>
-            </w:r>
-          </w:p>
-        </w:tc>
-        <w:tc>
-          <w:tcPr>
-            <w:tcW w:w="2212" w:type="dxa"/>
+            </w:pPr>
+            <w:r>
+              <w:rPr>
+                <w:rFonts w:cs="Verdana" w:ascii="Verdana" w:hAnsi="Verdana"/>
+                <w:sz w:val="22"/>
+                <w:lang w:val="en-US"/>
+              </w:rPr>
+              <w:t xml:space="preserve">Start Sibelius met huidige muziek XML bestand </w:t>
+            </w:r>
+          </w:p>
+        </w:tc>
+        <w:tc>
+          <w:tcPr>
+            <w:tcW w:w="2214" w:type="dxa"/>
             <w:tcBorders>
               <w:left w:val="single" w:sz="2" w:space="0" w:color="000000"/>
               <w:bottom w:val="single" w:sz="2" w:space="0" w:color="000000"/>
@@ -6448,7 +6488,7 @@
                 <w:sz w:val="22"/>
                 <w:lang w:val="en-US"/>
               </w:rPr>
-              <w:t>ALT + K + F</w:t>
+              <w:t>ALT + K + S</w:t>
             </w:r>
           </w:p>
         </w:tc>
@@ -6457,7 +6497,7 @@
         <w:trPr/>
         <w:tc>
           <w:tcPr>
-            <w:tcW w:w="1583" w:type="dxa"/>
+            <w:tcW w:w="1582" w:type="dxa"/>
             <w:tcBorders>
               <w:left w:val="single" w:sz="2" w:space="0" w:color="000000"/>
               <w:bottom w:val="single" w:sz="2" w:space="0" w:color="000000"/>
@@ -6467,23 +6507,17 @@
           <w:p>
             <w:pPr>
               <w:pStyle w:val="Tabelindhold"/>
-              <w:rPr>
-                <w:rFonts w:ascii="Verdana" w:hAnsi="Verdana" w:cs="Verdana"/>
-                <w:sz w:val="22"/>
-              </w:rPr>
-            </w:pPr>
-            <w:r>
-              <w:rPr>
-                <w:rFonts w:cs="Verdana" w:ascii="Verdana" w:hAnsi="Verdana"/>
-                <w:sz w:val="22"/>
-              </w:rPr>
+              <w:rPr/>
+            </w:pPr>
+            <w:r>
+              <w:rPr/>
               <w:t>Tools</w:t>
             </w:r>
           </w:p>
         </w:tc>
         <w:tc>
           <w:tcPr>
-            <w:tcW w:w="5220" w:type="dxa"/>
+            <w:tcW w:w="5219" w:type="dxa"/>
             <w:tcBorders>
               <w:left w:val="single" w:sz="2" w:space="0" w:color="000000"/>
               <w:bottom w:val="single" w:sz="2" w:space="0" w:color="000000"/>
@@ -6499,14 +6533,15 @@
               <w:rPr>
                 <w:rFonts w:cs="Verdana" w:ascii="Verdana" w:hAnsi="Verdana"/>
                 <w:sz w:val="22"/>
-              </w:rPr>
-              <w:t>Log bestand</w:t>
-            </w:r>
-          </w:p>
-        </w:tc>
-        <w:tc>
-          <w:tcPr>
-            <w:tcW w:w="2212" w:type="dxa"/>
+                <w:lang w:val="en-US"/>
+              </w:rPr>
+              <w:t xml:space="preserve">Start Capella met huidige muziek XML bestand </w:t>
+            </w:r>
+          </w:p>
+        </w:tc>
+        <w:tc>
+          <w:tcPr>
+            <w:tcW w:w="2214" w:type="dxa"/>
             <w:tcBorders>
               <w:left w:val="single" w:sz="2" w:space="0" w:color="000000"/>
               <w:bottom w:val="single" w:sz="2" w:space="0" w:color="000000"/>
@@ -6519,16 +6554,17 @@
               <w:pStyle w:val="Tabelindhold"/>
               <w:snapToGrid w:val="false"/>
               <w:rPr>
-                <w:rFonts w:ascii="Verdana" w:hAnsi="Verdana" w:cs="Verdana"/>
-                <w:sz w:val="22"/>
-              </w:rPr>
-            </w:pPr>
-            <w:r>
-              <w:rPr>
-                <w:rFonts w:cs="Verdana" w:ascii="Verdana" w:hAnsi="Verdana"/>
-                <w:sz w:val="22"/>
-              </w:rPr>
-              <w:t>ALT + K + L</w:t>
+                <w:color w:val="000000"/>
+              </w:rPr>
+            </w:pPr>
+            <w:r>
+              <w:rPr>
+                <w:rFonts w:cs="Verdana" w:ascii="Verdana" w:hAnsi="Verdana"/>
+                <w:color w:val="000000"/>
+                <w:sz w:val="22"/>
+                <w:lang w:val="en-US"/>
+              </w:rPr>
+              <w:t>ALT + K + C</w:t>
             </w:r>
           </w:p>
         </w:tc>
@@ -6537,7 +6573,7 @@
         <w:trPr/>
         <w:tc>
           <w:tcPr>
-            <w:tcW w:w="1583" w:type="dxa"/>
+            <w:tcW w:w="1582" w:type="dxa"/>
             <w:tcBorders>
               <w:left w:val="single" w:sz="2" w:space="0" w:color="000000"/>
               <w:bottom w:val="single" w:sz="2" w:space="0" w:color="000000"/>
@@ -6547,23 +6583,17 @@
           <w:p>
             <w:pPr>
               <w:pStyle w:val="Tabelindhold"/>
-              <w:rPr>
-                <w:rFonts w:ascii="Verdana" w:hAnsi="Verdana" w:cs="Verdana"/>
-                <w:sz w:val="22"/>
-              </w:rPr>
-            </w:pPr>
-            <w:r>
-              <w:rPr>
-                <w:rFonts w:cs="Verdana" w:ascii="Verdana" w:hAnsi="Verdana"/>
-                <w:sz w:val="22"/>
-              </w:rPr>
+              <w:rPr/>
+            </w:pPr>
+            <w:r>
+              <w:rPr/>
               <w:t>Tools</w:t>
             </w:r>
           </w:p>
         </w:tc>
         <w:tc>
           <w:tcPr>
-            <w:tcW w:w="5220" w:type="dxa"/>
+            <w:tcW w:w="5219" w:type="dxa"/>
             <w:tcBorders>
               <w:left w:val="single" w:sz="2" w:space="0" w:color="000000"/>
               <w:bottom w:val="single" w:sz="2" w:space="0" w:color="000000"/>
@@ -6581,13 +6611,13 @@
                 <w:sz w:val="22"/>
                 <w:lang w:val="en-US"/>
               </w:rPr>
-              <w:t>Pad log bestand</w:t>
-            </w:r>
-          </w:p>
-        </w:tc>
-        <w:tc>
-          <w:tcPr>
-            <w:tcW w:w="2212" w:type="dxa"/>
+              <w:t xml:space="preserve">Start Finale met huidige muziek XML bestand </w:t>
+            </w:r>
+          </w:p>
+        </w:tc>
+        <w:tc>
+          <w:tcPr>
+            <w:tcW w:w="2214" w:type="dxa"/>
             <w:tcBorders>
               <w:left w:val="single" w:sz="2" w:space="0" w:color="000000"/>
               <w:bottom w:val="single" w:sz="2" w:space="0" w:color="000000"/>
@@ -6600,18 +6630,17 @@
               <w:pStyle w:val="Tabelindhold"/>
               <w:snapToGrid w:val="false"/>
               <w:rPr>
-                <w:rFonts w:ascii="Verdana" w:hAnsi="Verdana" w:cs="Verdana"/>
+                <w:color w:val="000000"/>
+              </w:rPr>
+            </w:pPr>
+            <w:r>
+              <w:rPr>
+                <w:rFonts w:cs="Verdana" w:ascii="Verdana" w:hAnsi="Verdana"/>
+                <w:color w:val="000000"/>
                 <w:sz w:val="22"/>
                 <w:lang w:val="en-US"/>
               </w:rPr>
-            </w:pPr>
-            <w:r>
-              <w:rPr>
-                <w:rFonts w:cs="Verdana" w:ascii="Verdana" w:hAnsi="Verdana"/>
-                <w:sz w:val="22"/>
-                <w:lang w:val="en-US"/>
-              </w:rPr>
-              <w:t>ALT + K + P</w:t>
+              <w:t>ALT + K + F</w:t>
             </w:r>
           </w:p>
         </w:tc>
@@ -6620,7 +6649,7 @@
         <w:trPr/>
         <w:tc>
           <w:tcPr>
-            <w:tcW w:w="1583" w:type="dxa"/>
+            <w:tcW w:w="1582" w:type="dxa"/>
             <w:tcBorders>
               <w:left w:val="single" w:sz="2" w:space="0" w:color="000000"/>
               <w:bottom w:val="single" w:sz="2" w:space="0" w:color="000000"/>
@@ -6630,25 +6659,22 @@
           <w:p>
             <w:pPr>
               <w:pStyle w:val="Tabelindhold"/>
+              <w:rPr/>
+            </w:pPr>
+            <w:r>
               <w:rPr>
                 <w:rFonts w:ascii="Verdana" w:hAnsi="Verdana"/>
+                <w:color w:val="C9211E"/>
                 <w:sz w:val="22"/>
                 <w:szCs w:val="22"/>
               </w:rPr>
-            </w:pPr>
-            <w:r>
-              <w:rPr>
-                <w:rFonts w:ascii="Verdana" w:hAnsi="Verdana"/>
-                <w:sz w:val="22"/>
-                <w:szCs w:val="22"/>
-              </w:rPr>
               <w:t>Tools</w:t>
             </w:r>
           </w:p>
         </w:tc>
         <w:tc>
           <w:tcPr>
-            <w:tcW w:w="5220" w:type="dxa"/>
+            <w:tcW w:w="5219" w:type="dxa"/>
             <w:tcBorders>
               <w:left w:val="single" w:sz="2" w:space="0" w:color="000000"/>
               <w:bottom w:val="single" w:sz="2" w:space="0" w:color="000000"/>
@@ -6658,25 +6684,22 @@
           <w:p>
             <w:pPr>
               <w:pStyle w:val="Tabelindhold"/>
+              <w:rPr/>
+            </w:pPr>
+            <w:r>
               <w:rPr>
                 <w:rFonts w:ascii="Verdana" w:hAnsi="Verdana"/>
+                <w:color w:val="C9211E"/>
                 <w:sz w:val="22"/>
                 <w:szCs w:val="22"/>
               </w:rPr>
-            </w:pPr>
-            <w:r>
-              <w:rPr>
-                <w:rFonts w:ascii="Verdana" w:hAnsi="Verdana"/>
-                <w:sz w:val="22"/>
-                <w:szCs w:val="22"/>
-              </w:rPr>
-              <w:t>Pad muziek XML bestand</w:t>
-            </w:r>
-          </w:p>
-        </w:tc>
-        <w:tc>
-          <w:tcPr>
-            <w:tcW w:w="2212" w:type="dxa"/>
+              <w:t>Start PhotoScore</w:t>
+            </w:r>
+          </w:p>
+        </w:tc>
+        <w:tc>
+          <w:tcPr>
+            <w:tcW w:w="2214" w:type="dxa"/>
             <w:tcBorders>
               <w:left w:val="single" w:sz="2" w:space="0" w:color="000000"/>
               <w:bottom w:val="single" w:sz="2" w:space="0" w:color="000000"/>
@@ -6688,19 +6711,16 @@
             <w:pPr>
               <w:pStyle w:val="Tabelindhold"/>
               <w:snapToGrid w:val="false"/>
-              <w:rPr>
-                <w:rFonts w:ascii="Verdana" w:hAnsi="Verdana" w:cs="Verdana"/>
-                <w:sz w:val="22"/>
-                <w:lang w:val="en-US"/>
-              </w:rPr>
-            </w:pPr>
-            <w:r>
-              <w:rPr>
-                <w:rFonts w:cs="Verdana" w:ascii="Verdana" w:hAnsi="Verdana"/>
-                <w:sz w:val="22"/>
-                <w:lang w:val="en-US"/>
-              </w:rPr>
-              <w:t>ALT + K + B</w:t>
+              <w:rPr/>
+            </w:pPr>
+            <w:r>
+              <w:rPr>
+                <w:rFonts w:cs="Verdana" w:ascii="Verdana" w:hAnsi="Verdana"/>
+                <w:color w:val="C9211E"/>
+                <w:sz w:val="22"/>
+                <w:szCs w:val="22"/>
+              </w:rPr>
+              <w:t>ALT + T + P</w:t>
             </w:r>
           </w:p>
         </w:tc>
@@ -6709,7 +6729,7 @@
         <w:trPr/>
         <w:tc>
           <w:tcPr>
-            <w:tcW w:w="1583" w:type="dxa"/>
+            <w:tcW w:w="1582" w:type="dxa"/>
             <w:tcBorders>
               <w:left w:val="single" w:sz="2" w:space="0" w:color="000000"/>
               <w:bottom w:val="single" w:sz="2" w:space="0" w:color="000000"/>
@@ -6719,15 +6739,14 @@
           <w:p>
             <w:pPr>
               <w:pStyle w:val="Tabelindhold"/>
-              <w:rPr>
-                <w:rFonts w:ascii="Verdana" w:hAnsi="Verdana" w:cs="Verdana"/>
-                <w:sz w:val="22"/>
-              </w:rPr>
-            </w:pPr>
-            <w:r>
-              <w:rPr>
-                <w:rFonts w:cs="Verdana" w:ascii="Verdana" w:hAnsi="Verdana"/>
-                <w:sz w:val="22"/>
+              <w:rPr/>
+            </w:pPr>
+            <w:r>
+              <w:rPr>
+                <w:rFonts w:ascii="Verdana" w:hAnsi="Verdana"/>
+                <w:color w:val="C9211E"/>
+                <w:sz w:val="22"/>
+                <w:szCs w:val="22"/>
               </w:rPr>
               <w:t>Tools</w:t>
             </w:r>
@@ -6735,7 +6754,7 @@
         </w:tc>
         <w:tc>
           <w:tcPr>
-            <w:tcW w:w="5220" w:type="dxa"/>
+            <w:tcW w:w="5219" w:type="dxa"/>
             <w:tcBorders>
               <w:left w:val="single" w:sz="2" w:space="0" w:color="000000"/>
               <w:bottom w:val="single" w:sz="2" w:space="0" w:color="000000"/>
@@ -6749,17 +6768,18 @@
             </w:pPr>
             <w:r>
               <w:rPr>
-                <w:rFonts w:cs="Verdana" w:ascii="Verdana" w:hAnsi="Verdana"/>
-                <w:sz w:val="22"/>
-                <w:lang w:val="en-US"/>
-              </w:rPr>
-              <w:t>Open huidig muziek XML bestand als ruw XML bestand</w:t>
-            </w:r>
-          </w:p>
-        </w:tc>
-        <w:tc>
-          <w:tcPr>
-            <w:tcW w:w="2212" w:type="dxa"/>
+                <w:rFonts w:ascii="Verdana" w:hAnsi="Verdana"/>
+                <w:color w:val="C9211E"/>
+                <w:sz w:val="22"/>
+                <w:szCs w:val="22"/>
+              </w:rPr>
+              <w:t>Start Music Braille Editor 2</w:t>
+            </w:r>
+          </w:p>
+        </w:tc>
+        <w:tc>
+          <w:tcPr>
+            <w:tcW w:w="2214" w:type="dxa"/>
             <w:tcBorders>
               <w:left w:val="single" w:sz="2" w:space="0" w:color="000000"/>
               <w:bottom w:val="single" w:sz="2" w:space="0" w:color="000000"/>
@@ -6771,19 +6791,16 @@
             <w:pPr>
               <w:pStyle w:val="Tabelindhold"/>
               <w:snapToGrid w:val="false"/>
-              <w:rPr>
-                <w:rFonts w:ascii="Verdana" w:hAnsi="Verdana" w:cs="Verdana"/>
-                <w:sz w:val="22"/>
-                <w:lang w:val="en-US"/>
-              </w:rPr>
-            </w:pPr>
-            <w:r>
-              <w:rPr>
-                <w:rFonts w:cs="Verdana" w:ascii="Verdana" w:hAnsi="Verdana"/>
-                <w:sz w:val="22"/>
-                <w:lang w:val="en-US"/>
-              </w:rPr>
-              <w:t>ALT + K + X</w:t>
+              <w:rPr/>
+            </w:pPr>
+            <w:r>
+              <w:rPr>
+                <w:rFonts w:cs="Verdana" w:ascii="Verdana" w:hAnsi="Verdana"/>
+                <w:color w:val="C9211E"/>
+                <w:sz w:val="22"/>
+                <w:szCs w:val="22"/>
+              </w:rPr>
+              <w:t>ALT + T + E</w:t>
             </w:r>
           </w:p>
         </w:tc>
@@ -6792,7 +6809,7 @@
         <w:trPr/>
         <w:tc>
           <w:tcPr>
-            <w:tcW w:w="1583" w:type="dxa"/>
+            <w:tcW w:w="1582" w:type="dxa"/>
             <w:tcBorders>
               <w:left w:val="single" w:sz="2" w:space="0" w:color="000000"/>
               <w:bottom w:val="single" w:sz="2" w:space="0" w:color="000000"/>
@@ -6818,7 +6835,7 @@
         </w:tc>
         <w:tc>
           <w:tcPr>
-            <w:tcW w:w="5220" w:type="dxa"/>
+            <w:tcW w:w="5219" w:type="dxa"/>
             <w:tcBorders>
               <w:left w:val="single" w:sz="2" w:space="0" w:color="000000"/>
               <w:bottom w:val="single" w:sz="2" w:space="0" w:color="000000"/>
@@ -6834,15 +6851,14 @@
               <w:rPr>
                 <w:rFonts w:cs="Verdana" w:ascii="Verdana" w:hAnsi="Verdana"/>
                 <w:sz w:val="22"/>
-                <w:lang w:val="en-US"/>
-              </w:rPr>
-              <w:t>Open huidig muziek XML bestand als ruw XML bestand met Google Chrome</w:t>
-            </w:r>
-          </w:p>
-        </w:tc>
-        <w:tc>
-          <w:tcPr>
-            <w:tcW w:w="2212" w:type="dxa"/>
+              </w:rPr>
+              <w:t>Log bestand</w:t>
+            </w:r>
+          </w:p>
+        </w:tc>
+        <w:tc>
+          <w:tcPr>
+            <w:tcW w:w="2214" w:type="dxa"/>
             <w:tcBorders>
               <w:left w:val="single" w:sz="2" w:space="0" w:color="000000"/>
               <w:bottom w:val="single" w:sz="2" w:space="0" w:color="000000"/>
@@ -6857,16 +6873,14 @@
               <w:rPr>
                 <w:rFonts w:ascii="Verdana" w:hAnsi="Verdana" w:cs="Verdana"/>
                 <w:sz w:val="22"/>
-                <w:lang w:val="en-US"/>
-              </w:rPr>
-            </w:pPr>
-            <w:r>
-              <w:rPr>
-                <w:rFonts w:cs="Verdana" w:ascii="Verdana" w:hAnsi="Verdana"/>
-                <w:sz w:val="22"/>
-                <w:lang w:val="en-US"/>
-              </w:rPr>
-              <w:t>ALT + K + G</w:t>
+              </w:rPr>
+            </w:pPr>
+            <w:r>
+              <w:rPr>
+                <w:rFonts w:cs="Verdana" w:ascii="Verdana" w:hAnsi="Verdana"/>
+                <w:sz w:val="22"/>
+              </w:rPr>
+              <w:t>ALT + K + L</w:t>
             </w:r>
           </w:p>
         </w:tc>
@@ -6875,7 +6889,7 @@
         <w:trPr/>
         <w:tc>
           <w:tcPr>
-            <w:tcW w:w="1583" w:type="dxa"/>
+            <w:tcW w:w="1582" w:type="dxa"/>
             <w:tcBorders>
               <w:left w:val="single" w:sz="2" w:space="0" w:color="000000"/>
               <w:bottom w:val="single" w:sz="2" w:space="0" w:color="000000"/>
@@ -6901,7 +6915,7 @@
         </w:tc>
         <w:tc>
           <w:tcPr>
-            <w:tcW w:w="5220" w:type="dxa"/>
+            <w:tcW w:w="5219" w:type="dxa"/>
             <w:tcBorders>
               <w:left w:val="single" w:sz="2" w:space="0" w:color="000000"/>
               <w:bottom w:val="single" w:sz="2" w:space="0" w:color="000000"/>
@@ -6919,13 +6933,13 @@
                 <w:sz w:val="22"/>
                 <w:lang w:val="en-US"/>
               </w:rPr>
-              <w:t>Open JAWS instellingen voor IBOS XML muzieklezer</w:t>
-            </w:r>
-          </w:p>
-        </w:tc>
-        <w:tc>
-          <w:tcPr>
-            <w:tcW w:w="2212" w:type="dxa"/>
+              <w:t>Pad log bestand</w:t>
+            </w:r>
+          </w:p>
+        </w:tc>
+        <w:tc>
+          <w:tcPr>
+            <w:tcW w:w="2214" w:type="dxa"/>
             <w:tcBorders>
               <w:left w:val="single" w:sz="2" w:space="0" w:color="000000"/>
               <w:bottom w:val="single" w:sz="2" w:space="0" w:color="000000"/>
@@ -6949,7 +6963,7 @@
                 <w:sz w:val="22"/>
                 <w:lang w:val="en-US"/>
               </w:rPr>
-              <w:t>ALT + K + J</w:t>
+              <w:t>ALT + K + P</w:t>
             </w:r>
           </w:p>
         </w:tc>
@@ -6958,7 +6972,7 @@
         <w:trPr/>
         <w:tc>
           <w:tcPr>
-            <w:tcW w:w="1583" w:type="dxa"/>
+            <w:tcW w:w="1582" w:type="dxa"/>
             <w:tcBorders>
               <w:left w:val="single" w:sz="2" w:space="0" w:color="000000"/>
               <w:bottom w:val="single" w:sz="2" w:space="0" w:color="000000"/>
@@ -6969,14 +6983,16 @@
             <w:pPr>
               <w:pStyle w:val="Tabelindhold"/>
               <w:rPr>
-                <w:rFonts w:ascii="Verdana" w:hAnsi="Verdana" w:cs="Verdana"/>
-                <w:sz w:val="22"/>
-              </w:rPr>
-            </w:pPr>
-            <w:r>
-              <w:rPr>
-                <w:rFonts w:cs="Verdana" w:ascii="Verdana" w:hAnsi="Verdana"/>
-                <w:sz w:val="22"/>
+                <w:rFonts w:ascii="Verdana" w:hAnsi="Verdana"/>
+                <w:sz w:val="22"/>
+                <w:szCs w:val="22"/>
+              </w:rPr>
+            </w:pPr>
+            <w:r>
+              <w:rPr>
+                <w:rFonts w:ascii="Verdana" w:hAnsi="Verdana"/>
+                <w:sz w:val="22"/>
+                <w:szCs w:val="22"/>
               </w:rPr>
               <w:t>Tools</w:t>
             </w:r>
@@ -6984,7 +7000,7 @@
         </w:tc>
         <w:tc>
           <w:tcPr>
-            <w:tcW w:w="5220" w:type="dxa"/>
+            <w:tcW w:w="5219" w:type="dxa"/>
             <w:tcBorders>
               <w:left w:val="single" w:sz="2" w:space="0" w:color="000000"/>
               <w:bottom w:val="single" w:sz="2" w:space="0" w:color="000000"/>
@@ -6995,24 +7011,24 @@
             <w:pPr>
               <w:pStyle w:val="Tabelindhold"/>
               <w:rPr>
-                <w:rFonts w:ascii="Verdana" w:hAnsi="Verdana" w:cs="Verdana"/>
-                <w:sz w:val="22"/>
-                <w:lang w:val="en-US"/>
-              </w:rPr>
-            </w:pPr>
-            <w:r>
-              <w:rPr>
-                <w:rFonts w:cs="Verdana" w:ascii="Verdana" w:hAnsi="Verdana"/>
-                <w:sz w:val="22"/>
-                <w:lang w:val="en-US"/>
-              </w:rPr>
-              <w:t>Open gebruikersinstellingen als ruw XML bestand</w:t>
-            </w:r>
-          </w:p>
-        </w:tc>
-        <w:tc>
-          <w:tcPr>
-            <w:tcW w:w="2212" w:type="dxa"/>
+                <w:rFonts w:ascii="Verdana" w:hAnsi="Verdana"/>
+                <w:sz w:val="22"/>
+                <w:szCs w:val="22"/>
+              </w:rPr>
+            </w:pPr>
+            <w:r>
+              <w:rPr>
+                <w:rFonts w:ascii="Verdana" w:hAnsi="Verdana"/>
+                <w:sz w:val="22"/>
+                <w:szCs w:val="22"/>
+              </w:rPr>
+              <w:t>Pad muziek XML bestand</w:t>
+            </w:r>
+          </w:p>
+        </w:tc>
+        <w:tc>
+          <w:tcPr>
+            <w:tcW w:w="2214" w:type="dxa"/>
             <w:tcBorders>
               <w:left w:val="single" w:sz="2" w:space="0" w:color="000000"/>
               <w:bottom w:val="single" w:sz="2" w:space="0" w:color="000000"/>
@@ -7036,7 +7052,7 @@
                 <w:sz w:val="22"/>
                 <w:lang w:val="en-US"/>
               </w:rPr>
-              <w:t>ALT + K + I</w:t>
+              <w:t>ALT + K + B</w:t>
             </w:r>
           </w:p>
         </w:tc>
@@ -7045,7 +7061,7 @@
         <w:trPr/>
         <w:tc>
           <w:tcPr>
-            <w:tcW w:w="1583" w:type="dxa"/>
+            <w:tcW w:w="1582" w:type="dxa"/>
             <w:tcBorders>
               <w:left w:val="single" w:sz="2" w:space="0" w:color="000000"/>
               <w:bottom w:val="single" w:sz="2" w:space="0" w:color="000000"/>
@@ -7065,13 +7081,349 @@
                 <w:rFonts w:cs="Verdana" w:ascii="Verdana" w:hAnsi="Verdana"/>
                 <w:sz w:val="22"/>
               </w:rPr>
+              <w:t>Tools</w:t>
+            </w:r>
+          </w:p>
+        </w:tc>
+        <w:tc>
+          <w:tcPr>
+            <w:tcW w:w="5219" w:type="dxa"/>
+            <w:tcBorders>
+              <w:left w:val="single" w:sz="2" w:space="0" w:color="000000"/>
+              <w:bottom w:val="single" w:sz="2" w:space="0" w:color="000000"/>
+            </w:tcBorders>
+            <w:shd w:color="auto" w:fill="auto" w:val="clear"/>
+          </w:tcPr>
+          <w:p>
+            <w:pPr>
+              <w:pStyle w:val="Tabelindhold"/>
+              <w:rPr/>
+            </w:pPr>
+            <w:r>
+              <w:rPr>
+                <w:rFonts w:cs="Verdana" w:ascii="Verdana" w:hAnsi="Verdana"/>
+                <w:sz w:val="22"/>
+                <w:lang w:val="en-US"/>
+              </w:rPr>
+              <w:t>Open huidig muziek XML bestand als ruw XML bestand</w:t>
+            </w:r>
+          </w:p>
+        </w:tc>
+        <w:tc>
+          <w:tcPr>
+            <w:tcW w:w="2214" w:type="dxa"/>
+            <w:tcBorders>
+              <w:left w:val="single" w:sz="2" w:space="0" w:color="000000"/>
+              <w:bottom w:val="single" w:sz="2" w:space="0" w:color="000000"/>
+              <w:right w:val="single" w:sz="2" w:space="0" w:color="000000"/>
+            </w:tcBorders>
+            <w:shd w:color="auto" w:fill="auto" w:val="clear"/>
+          </w:tcPr>
+          <w:p>
+            <w:pPr>
+              <w:pStyle w:val="Tabelindhold"/>
+              <w:snapToGrid w:val="false"/>
+              <w:rPr>
+                <w:rFonts w:ascii="Verdana" w:hAnsi="Verdana" w:cs="Verdana"/>
+                <w:sz w:val="22"/>
+                <w:lang w:val="en-US"/>
+              </w:rPr>
+            </w:pPr>
+            <w:r>
+              <w:rPr>
+                <w:rFonts w:cs="Verdana" w:ascii="Verdana" w:hAnsi="Verdana"/>
+                <w:sz w:val="22"/>
+                <w:lang w:val="en-US"/>
+              </w:rPr>
+              <w:t>ALT + K + X</w:t>
+            </w:r>
+          </w:p>
+        </w:tc>
+      </w:tr>
+      <w:tr>
+        <w:trPr/>
+        <w:tc>
+          <w:tcPr>
+            <w:tcW w:w="1582" w:type="dxa"/>
+            <w:tcBorders>
+              <w:left w:val="single" w:sz="2" w:space="0" w:color="000000"/>
+              <w:bottom w:val="single" w:sz="2" w:space="0" w:color="000000"/>
+            </w:tcBorders>
+            <w:shd w:color="auto" w:fill="auto" w:val="clear"/>
+          </w:tcPr>
+          <w:p>
+            <w:pPr>
+              <w:pStyle w:val="Tabelindhold"/>
+              <w:rPr>
+                <w:rFonts w:ascii="Verdana" w:hAnsi="Verdana" w:cs="Verdana"/>
+                <w:sz w:val="22"/>
+              </w:rPr>
+            </w:pPr>
+            <w:r>
+              <w:rPr>
+                <w:rFonts w:cs="Verdana" w:ascii="Verdana" w:hAnsi="Verdana"/>
+                <w:sz w:val="22"/>
+              </w:rPr>
+              <w:t>Tools</w:t>
+            </w:r>
+          </w:p>
+        </w:tc>
+        <w:tc>
+          <w:tcPr>
+            <w:tcW w:w="5219" w:type="dxa"/>
+            <w:tcBorders>
+              <w:left w:val="single" w:sz="2" w:space="0" w:color="000000"/>
+              <w:bottom w:val="single" w:sz="2" w:space="0" w:color="000000"/>
+            </w:tcBorders>
+            <w:shd w:color="auto" w:fill="auto" w:val="clear"/>
+          </w:tcPr>
+          <w:p>
+            <w:pPr>
+              <w:pStyle w:val="Tabelindhold"/>
+              <w:rPr/>
+            </w:pPr>
+            <w:r>
+              <w:rPr>
+                <w:rFonts w:cs="Verdana" w:ascii="Verdana" w:hAnsi="Verdana"/>
+                <w:sz w:val="22"/>
+                <w:lang w:val="en-US"/>
+              </w:rPr>
+              <w:t>Open huidig muziek XML bestand als ruw XML bestand met Google Chrome</w:t>
+            </w:r>
+          </w:p>
+        </w:tc>
+        <w:tc>
+          <w:tcPr>
+            <w:tcW w:w="2214" w:type="dxa"/>
+            <w:tcBorders>
+              <w:left w:val="single" w:sz="2" w:space="0" w:color="000000"/>
+              <w:bottom w:val="single" w:sz="2" w:space="0" w:color="000000"/>
+              <w:right w:val="single" w:sz="2" w:space="0" w:color="000000"/>
+            </w:tcBorders>
+            <w:shd w:color="auto" w:fill="auto" w:val="clear"/>
+          </w:tcPr>
+          <w:p>
+            <w:pPr>
+              <w:pStyle w:val="Tabelindhold"/>
+              <w:snapToGrid w:val="false"/>
+              <w:rPr>
+                <w:rFonts w:ascii="Verdana" w:hAnsi="Verdana" w:cs="Verdana"/>
+                <w:sz w:val="22"/>
+                <w:lang w:val="en-US"/>
+              </w:rPr>
+            </w:pPr>
+            <w:r>
+              <w:rPr>
+                <w:rFonts w:cs="Verdana" w:ascii="Verdana" w:hAnsi="Verdana"/>
+                <w:sz w:val="22"/>
+                <w:lang w:val="en-US"/>
+              </w:rPr>
+              <w:t>ALT + K + G</w:t>
+            </w:r>
+          </w:p>
+        </w:tc>
+      </w:tr>
+      <w:tr>
+        <w:trPr/>
+        <w:tc>
+          <w:tcPr>
+            <w:tcW w:w="1582" w:type="dxa"/>
+            <w:tcBorders>
+              <w:left w:val="single" w:sz="2" w:space="0" w:color="000000"/>
+              <w:bottom w:val="single" w:sz="2" w:space="0" w:color="000000"/>
+            </w:tcBorders>
+            <w:shd w:color="auto" w:fill="auto" w:val="clear"/>
+          </w:tcPr>
+          <w:p>
+            <w:pPr>
+              <w:pStyle w:val="Tabelindhold"/>
+              <w:rPr>
+                <w:rFonts w:ascii="Verdana" w:hAnsi="Verdana" w:cs="Verdana"/>
+                <w:sz w:val="22"/>
+              </w:rPr>
+            </w:pPr>
+            <w:r>
+              <w:rPr>
+                <w:rFonts w:cs="Verdana" w:ascii="Verdana" w:hAnsi="Verdana"/>
+                <w:sz w:val="22"/>
+              </w:rPr>
+              <w:t>Tools</w:t>
+            </w:r>
+          </w:p>
+        </w:tc>
+        <w:tc>
+          <w:tcPr>
+            <w:tcW w:w="5219" w:type="dxa"/>
+            <w:tcBorders>
+              <w:left w:val="single" w:sz="2" w:space="0" w:color="000000"/>
+              <w:bottom w:val="single" w:sz="2" w:space="0" w:color="000000"/>
+            </w:tcBorders>
+            <w:shd w:color="auto" w:fill="auto" w:val="clear"/>
+          </w:tcPr>
+          <w:p>
+            <w:pPr>
+              <w:pStyle w:val="Tabelindhold"/>
+              <w:rPr/>
+            </w:pPr>
+            <w:r>
+              <w:rPr>
+                <w:rFonts w:cs="Verdana" w:ascii="Verdana" w:hAnsi="Verdana"/>
+                <w:sz w:val="22"/>
+                <w:lang w:val="en-US"/>
+              </w:rPr>
+              <w:t>Open JAWS instellingen voor IBOS XML muzieklezer</w:t>
+            </w:r>
+          </w:p>
+        </w:tc>
+        <w:tc>
+          <w:tcPr>
+            <w:tcW w:w="2214" w:type="dxa"/>
+            <w:tcBorders>
+              <w:left w:val="single" w:sz="2" w:space="0" w:color="000000"/>
+              <w:bottom w:val="single" w:sz="2" w:space="0" w:color="000000"/>
+              <w:right w:val="single" w:sz="2" w:space="0" w:color="000000"/>
+            </w:tcBorders>
+            <w:shd w:color="auto" w:fill="auto" w:val="clear"/>
+          </w:tcPr>
+          <w:p>
+            <w:pPr>
+              <w:pStyle w:val="Tabelindhold"/>
+              <w:snapToGrid w:val="false"/>
+              <w:rPr>
+                <w:rFonts w:ascii="Verdana" w:hAnsi="Verdana" w:cs="Verdana"/>
+                <w:sz w:val="22"/>
+                <w:lang w:val="en-US"/>
+              </w:rPr>
+            </w:pPr>
+            <w:r>
+              <w:rPr>
+                <w:rFonts w:cs="Verdana" w:ascii="Verdana" w:hAnsi="Verdana"/>
+                <w:sz w:val="22"/>
+                <w:lang w:val="en-US"/>
+              </w:rPr>
+              <w:t>ALT + K + J</w:t>
+            </w:r>
+          </w:p>
+        </w:tc>
+      </w:tr>
+      <w:tr>
+        <w:trPr/>
+        <w:tc>
+          <w:tcPr>
+            <w:tcW w:w="1582" w:type="dxa"/>
+            <w:tcBorders>
+              <w:left w:val="single" w:sz="2" w:space="0" w:color="000000"/>
+              <w:bottom w:val="single" w:sz="2" w:space="0" w:color="000000"/>
+            </w:tcBorders>
+            <w:shd w:color="auto" w:fill="auto" w:val="clear"/>
+          </w:tcPr>
+          <w:p>
+            <w:pPr>
+              <w:pStyle w:val="Tabelindhold"/>
+              <w:rPr>
+                <w:rFonts w:ascii="Verdana" w:hAnsi="Verdana" w:cs="Verdana"/>
+                <w:sz w:val="22"/>
+              </w:rPr>
+            </w:pPr>
+            <w:r>
+              <w:rPr>
+                <w:rFonts w:cs="Verdana" w:ascii="Verdana" w:hAnsi="Verdana"/>
+                <w:sz w:val="22"/>
+              </w:rPr>
+              <w:t>Tools</w:t>
+            </w:r>
+          </w:p>
+        </w:tc>
+        <w:tc>
+          <w:tcPr>
+            <w:tcW w:w="5219" w:type="dxa"/>
+            <w:tcBorders>
+              <w:left w:val="single" w:sz="2" w:space="0" w:color="000000"/>
+              <w:bottom w:val="single" w:sz="2" w:space="0" w:color="000000"/>
+            </w:tcBorders>
+            <w:shd w:color="auto" w:fill="auto" w:val="clear"/>
+          </w:tcPr>
+          <w:p>
+            <w:pPr>
+              <w:pStyle w:val="Tabelindhold"/>
+              <w:rPr>
+                <w:rFonts w:ascii="Verdana" w:hAnsi="Verdana" w:cs="Verdana"/>
+                <w:sz w:val="22"/>
+                <w:lang w:val="en-US"/>
+              </w:rPr>
+            </w:pPr>
+            <w:r>
+              <w:rPr>
+                <w:rFonts w:cs="Verdana" w:ascii="Verdana" w:hAnsi="Verdana"/>
+                <w:sz w:val="22"/>
+                <w:lang w:val="en-US"/>
+              </w:rPr>
+              <w:t>Open gebruikersinstellingen als ruw XML bestand</w:t>
+            </w:r>
+          </w:p>
+        </w:tc>
+        <w:tc>
+          <w:tcPr>
+            <w:tcW w:w="2214" w:type="dxa"/>
+            <w:tcBorders>
+              <w:left w:val="single" w:sz="2" w:space="0" w:color="000000"/>
+              <w:bottom w:val="single" w:sz="2" w:space="0" w:color="000000"/>
+              <w:right w:val="single" w:sz="2" w:space="0" w:color="000000"/>
+            </w:tcBorders>
+            <w:shd w:color="auto" w:fill="auto" w:val="clear"/>
+          </w:tcPr>
+          <w:p>
+            <w:pPr>
+              <w:pStyle w:val="Tabelindhold"/>
+              <w:snapToGrid w:val="false"/>
+              <w:rPr>
+                <w:rFonts w:ascii="Verdana" w:hAnsi="Verdana" w:cs="Verdana"/>
+                <w:sz w:val="22"/>
+                <w:lang w:val="en-US"/>
+              </w:rPr>
+            </w:pPr>
+            <w:r>
+              <w:rPr>
+                <w:rFonts w:cs="Verdana" w:ascii="Verdana" w:hAnsi="Verdana"/>
+                <w:sz w:val="22"/>
+                <w:lang w:val="en-US"/>
+              </w:rPr>
+              <w:t>ALT + K + I</w:t>
+            </w:r>
+          </w:p>
+        </w:tc>
+      </w:tr>
+      <w:tr>
+        <w:trPr/>
+        <w:tc>
+          <w:tcPr>
+            <w:tcW w:w="1582" w:type="dxa"/>
+            <w:tcBorders>
+              <w:left w:val="single" w:sz="2" w:space="0" w:color="000000"/>
+              <w:bottom w:val="single" w:sz="2" w:space="0" w:color="000000"/>
+            </w:tcBorders>
+            <w:shd w:color="auto" w:fill="auto" w:val="clear"/>
+          </w:tcPr>
+          <w:p>
+            <w:pPr>
+              <w:pStyle w:val="Tabelindhold"/>
+              <w:rPr>
+                <w:rFonts w:ascii="Verdana" w:hAnsi="Verdana" w:cs="Verdana"/>
+                <w:sz w:val="22"/>
+              </w:rPr>
+            </w:pPr>
+            <w:r>
+              <w:rPr>
+                <w:rFonts w:cs="Verdana" w:ascii="Verdana" w:hAnsi="Verdana"/>
+                <w:sz w:val="22"/>
+              </w:rPr>
               <w:t>Muziek bibliotheken</w:t>
             </w:r>
           </w:p>
         </w:tc>
         <w:tc>
           <w:tcPr>
-            <w:tcW w:w="5220" w:type="dxa"/>
+            <w:tcW w:w="5219" w:type="dxa"/>
             <w:tcBorders>
               <w:left w:val="single" w:sz="2" w:space="0" w:color="000000"/>
               <w:bottom w:val="single" w:sz="2" w:space="0" w:color="000000"/>
@@ -7192,7 +7544,7 @@
         </w:tc>
         <w:tc>
           <w:tcPr>
-            <w:tcW w:w="2212" w:type="dxa"/>
+            <w:tcW w:w="2214" w:type="dxa"/>
             <w:tcBorders>
               <w:left w:val="single" w:sz="2" w:space="0" w:color="000000"/>
               <w:bottom w:val="single" w:sz="2" w:space="0" w:color="000000"/>
@@ -7225,7 +7577,7 @@
         <w:trPr/>
         <w:tc>
           <w:tcPr>
-            <w:tcW w:w="1583" w:type="dxa"/>
+            <w:tcW w:w="1582" w:type="dxa"/>
             <w:tcBorders>
               <w:left w:val="single" w:sz="2" w:space="0" w:color="000000"/>
               <w:bottom w:val="single" w:sz="2" w:space="0" w:color="000000"/>
@@ -7251,7 +7603,7 @@
         </w:tc>
         <w:tc>
           <w:tcPr>
-            <w:tcW w:w="5220" w:type="dxa"/>
+            <w:tcW w:w="5219" w:type="dxa"/>
             <w:tcBorders>
               <w:left w:val="single" w:sz="2" w:space="0" w:color="000000"/>
               <w:bottom w:val="single" w:sz="2" w:space="0" w:color="000000"/>
@@ -7275,7 +7627,7 @@
         </w:tc>
         <w:tc>
           <w:tcPr>
-            <w:tcW w:w="2212" w:type="dxa"/>
+            <w:tcW w:w="2214" w:type="dxa"/>
             <w:tcBorders>
               <w:left w:val="single" w:sz="2" w:space="0" w:color="000000"/>
               <w:bottom w:val="single" w:sz="2" w:space="0" w:color="000000"/>
@@ -7310,7 +7662,7 @@
         <w:trPr/>
         <w:tc>
           <w:tcPr>
-            <w:tcW w:w="1583" w:type="dxa"/>
+            <w:tcW w:w="1582" w:type="dxa"/>
             <w:tcBorders>
               <w:left w:val="single" w:sz="2" w:space="0" w:color="000000"/>
               <w:bottom w:val="single" w:sz="2" w:space="0" w:color="000000"/>
@@ -7333,7 +7685,7 @@
         </w:tc>
         <w:tc>
           <w:tcPr>
-            <w:tcW w:w="5220" w:type="dxa"/>
+            <w:tcW w:w="5219" w:type="dxa"/>
             <w:tcBorders>
               <w:left w:val="single" w:sz="2" w:space="0" w:color="000000"/>
               <w:bottom w:val="single" w:sz="2" w:space="0" w:color="000000"/>
@@ -7357,7 +7709,7 @@
         </w:tc>
         <w:tc>
           <w:tcPr>
-            <w:tcW w:w="2212" w:type="dxa"/>
+            <w:tcW w:w="2214" w:type="dxa"/>
             <w:tcBorders>
               <w:left w:val="single" w:sz="2" w:space="0" w:color="000000"/>
               <w:bottom w:val="single" w:sz="2" w:space="0" w:color="000000"/>
@@ -7390,7 +7742,7 @@
         <w:trPr/>
         <w:tc>
           <w:tcPr>
-            <w:tcW w:w="1583" w:type="dxa"/>
+            <w:tcW w:w="1582" w:type="dxa"/>
             <w:tcBorders>
               <w:left w:val="single" w:sz="2" w:space="0" w:color="000000"/>
               <w:bottom w:val="single" w:sz="2" w:space="0" w:color="000000"/>
@@ -7413,7 +7765,7 @@
         </w:tc>
         <w:tc>
           <w:tcPr>
-            <w:tcW w:w="5220" w:type="dxa"/>
+            <w:tcW w:w="5219" w:type="dxa"/>
             <w:tcBorders>
               <w:left w:val="single" w:sz="2" w:space="0" w:color="000000"/>
               <w:bottom w:val="single" w:sz="2" w:space="0" w:color="000000"/>
@@ -7437,7 +7789,7 @@
         </w:tc>
         <w:tc>
           <w:tcPr>
-            <w:tcW w:w="2212" w:type="dxa"/>
+            <w:tcW w:w="2214" w:type="dxa"/>
             <w:tcBorders>
               <w:left w:val="single" w:sz="2" w:space="0" w:color="000000"/>
               <w:bottom w:val="single" w:sz="2" w:space="0" w:color="000000"/>
@@ -7470,7 +7822,7 @@
         <w:trPr/>
         <w:tc>
           <w:tcPr>
-            <w:tcW w:w="1583" w:type="dxa"/>
+            <w:tcW w:w="1582" w:type="dxa"/>
             <w:tcBorders>
               <w:left w:val="single" w:sz="2" w:space="0" w:color="000000"/>
               <w:bottom w:val="single" w:sz="2" w:space="0" w:color="000000"/>
@@ -7493,7 +7845,7 @@
         </w:tc>
         <w:tc>
           <w:tcPr>
-            <w:tcW w:w="5220" w:type="dxa"/>
+            <w:tcW w:w="5219" w:type="dxa"/>
             <w:tcBorders>
               <w:left w:val="single" w:sz="2" w:space="0" w:color="000000"/>
               <w:bottom w:val="single" w:sz="2" w:space="0" w:color="000000"/>
@@ -7517,7 +7869,7 @@
         </w:tc>
         <w:tc>
           <w:tcPr>
-            <w:tcW w:w="2212" w:type="dxa"/>
+            <w:tcW w:w="2214" w:type="dxa"/>
             <w:tcBorders>
               <w:left w:val="single" w:sz="2" w:space="0" w:color="000000"/>
               <w:bottom w:val="single" w:sz="2" w:space="0" w:color="000000"/>
@@ -8347,6 +8699,146 @@
           </w:p>
         </w:tc>
       </w:tr>
+      <w:tr>
+        <w:trPr/>
+        <w:tc>
+          <w:tcPr>
+            <w:tcW w:w="2261" w:type="dxa"/>
+            <w:tcBorders>
+              <w:left w:val="single" w:sz="4" w:space="0" w:color="000000"/>
+              <w:bottom w:val="single" w:sz="4" w:space="0" w:color="000000"/>
+            </w:tcBorders>
+            <w:shd w:color="auto" w:fill="auto" w:val="clear"/>
+          </w:tcPr>
+          <w:p>
+            <w:pPr>
+              <w:pStyle w:val="Tabelindhold"/>
+              <w:rPr>
+                <w:color w:val="C9211E"/>
+              </w:rPr>
+            </w:pPr>
+            <w:r>
+              <w:rPr>
+                <w:color w:val="C9211E"/>
+              </w:rPr>
+              <w:t>PhotoScore path</w:t>
+            </w:r>
+          </w:p>
+        </w:tc>
+        <w:tc>
+          <w:tcPr>
+            <w:tcW w:w="6764" w:type="dxa"/>
+            <w:tcBorders>
+              <w:left w:val="single" w:sz="4" w:space="0" w:color="000000"/>
+              <w:bottom w:val="single" w:sz="4" w:space="0" w:color="000000"/>
+              <w:right w:val="single" w:sz="4" w:space="0" w:color="000000"/>
+            </w:tcBorders>
+            <w:shd w:color="auto" w:fill="auto" w:val="clear"/>
+          </w:tcPr>
+          <w:p>
+            <w:pPr>
+              <w:pStyle w:val="Tabelindhold"/>
+              <w:rPr>
+                <w:color w:val="C9211E"/>
+              </w:rPr>
+            </w:pPr>
+            <w:r>
+              <w:rPr>
+                <w:color w:val="C9211E"/>
+              </w:rPr>
+              <w:t xml:space="preserve">Pad naar .exe file als </w:t>
+            </w:r>
+            <w:r>
+              <w:rPr>
+                <w:color w:val="C9211E"/>
+              </w:rPr>
+              <w:t>PhotoScore</w:t>
+            </w:r>
+            <w:r>
+              <w:rPr>
+                <w:color w:val="C9211E"/>
+              </w:rPr>
+              <w:t xml:space="preserve"> geïnstalleerd is</w:t>
+            </w:r>
+          </w:p>
+        </w:tc>
+      </w:tr>
+      <w:tr>
+        <w:trPr/>
+        <w:tc>
+          <w:tcPr>
+            <w:tcW w:w="2261" w:type="dxa"/>
+            <w:tcBorders>
+              <w:left w:val="single" w:sz="4" w:space="0" w:color="000000"/>
+              <w:bottom w:val="single" w:sz="4" w:space="0" w:color="000000"/>
+            </w:tcBorders>
+            <w:shd w:color="auto" w:fill="auto" w:val="clear"/>
+          </w:tcPr>
+          <w:p>
+            <w:pPr>
+              <w:pStyle w:val="Tabelindhold"/>
+              <w:rPr>
+                <w:color w:val="C9211E"/>
+                <w:sz w:val="18"/>
+                <w:szCs w:val="18"/>
+              </w:rPr>
+            </w:pPr>
+            <w:r>
+              <w:rPr>
+                <w:color w:val="C9211E"/>
+                <w:sz w:val="18"/>
+                <w:szCs w:val="18"/>
+              </w:rPr>
+              <w:t xml:space="preserve">Braille Music Editor 2 </w:t>
+            </w:r>
+            <w:r>
+              <w:rPr>
+                <w:color w:val="C9211E"/>
+                <w:sz w:val="18"/>
+                <w:szCs w:val="18"/>
+              </w:rPr>
+              <w:t>path</w:t>
+            </w:r>
+          </w:p>
+        </w:tc>
+        <w:tc>
+          <w:tcPr>
+            <w:tcW w:w="6764" w:type="dxa"/>
+            <w:tcBorders>
+              <w:left w:val="single" w:sz="4" w:space="0" w:color="000000"/>
+              <w:bottom w:val="single" w:sz="4" w:space="0" w:color="000000"/>
+              <w:right w:val="single" w:sz="4" w:space="0" w:color="000000"/>
+            </w:tcBorders>
+            <w:shd w:color="auto" w:fill="auto" w:val="clear"/>
+          </w:tcPr>
+          <w:p>
+            <w:pPr>
+              <w:pStyle w:val="Tabelindhold"/>
+              <w:rPr>
+                <w:color w:val="C9211E"/>
+              </w:rPr>
+            </w:pPr>
+            <w:r>
+              <w:rPr>
+                <w:color w:val="C9211E"/>
+              </w:rPr>
+              <w:t xml:space="preserve">Pad naar .exe file als </w:t>
+            </w:r>
+            <w:r>
+              <w:rPr>
+                <w:color w:val="C9211E"/>
+              </w:rPr>
+              <w:t>Braille Music Editor 2</w:t>
+            </w:r>
+            <w:r>
+              <w:rPr>
+                <w:color w:val="C9211E"/>
+              </w:rPr>
+              <w:t xml:space="preserve"> geïnstalleerd is</w:t>
+            </w:r>
+          </w:p>
+        </w:tc>
+      </w:tr>
     </w:tbl>
     <w:p>
       <w:pPr>
@@ -8397,22 +8889,46 @@
           <w:ilvl w:val="2"/>
           <w:numId w:val="3"/>
         </w:numPr>
+        <w:rPr/>
+      </w:pPr>
+      <w:bookmarkStart w:id="12" w:name="_Toc31150863"/>
+      <w:r>
         <w:rPr>
           <w:rFonts w:ascii="Verdana" w:hAnsi="Verdana"/>
           <w:sz w:val="28"/>
           <w:szCs w:val="28"/>
         </w:rPr>
-      </w:pPr>
-      <w:bookmarkStart w:id="12" w:name="_Toc31150863"/>
-      <w:r>
+        <w:t>Hulpmiddelen</w:t>
+      </w:r>
+      <w:bookmarkEnd w:id="12"/>
+    </w:p>
+    <w:p>
+      <w:pPr>
+        <w:pStyle w:val="Normal"/>
         <w:rPr>
           <w:rFonts w:ascii="Verdana" w:hAnsi="Verdana"/>
           <w:sz w:val="28"/>
           <w:szCs w:val="28"/>
         </w:rPr>
-        <w:t>Hulpmiddelen</w:t>
-      </w:r>
-      <w:bookmarkEnd w:id="12"/>
+      </w:pPr>
+      <w:r>
+        <w:rPr/>
+      </w:r>
+    </w:p>
+    <w:p>
+      <w:pPr>
+        <w:pStyle w:val="Normal"/>
+        <w:rPr/>
+      </w:pPr>
+      <w:r>
+        <w:rPr>
+          <w:rFonts w:ascii="Verdana" w:hAnsi="Verdana"/>
+          <w:color w:val="C9211E"/>
+          <w:sz w:val="22"/>
+          <w:szCs w:val="22"/>
+        </w:rPr>
+        <w:t>The “IBOS Music Braille Reader” item under “Tools” will start the integrated tool “IBOS Music Braille Reader”.  Using that tool the user can open exixting NOTA Music Braille files or files, just generated and exported by “IBOS Music Xml Reader”. The contents of the Music Braille file will be shown in a listbox in a textual representation.</w:t>
+      </w:r>
     </w:p>
     <w:p>
       <w:pPr>
@@ -8421,17 +8937,36 @@
           <w:ilvl w:val="0"/>
           <w:numId w:val="3"/>
         </w:numPr>
-        <w:rPr>
-          <w:rFonts w:ascii="Verdana" w:hAnsi="Verdana" w:eastAsia="Calibri" w:cs="Verdana"/>
-          <w:lang w:val="en-GB" w:eastAsia="zh-CN"/>
-        </w:rPr>
+        <w:rPr/>
       </w:pPr>
       <w:r>
         <w:rPr>
           <w:rFonts w:eastAsia="Calibri" w:cs="Verdana" w:ascii="Verdana" w:hAnsi="Verdana"/>
           <w:lang w:val="en-GB" w:eastAsia="zh-CN"/>
         </w:rPr>
-        <w:t>De items 'MuseScore', 'Sibelius', 'Capella' en 'Finale' starten deze programma's waarbij ze gebruik maken van de het Muziek XML-bestand dat in IBOS XML-muzieklezer geopend is. Dit is een voordeel in situaties waarin de gebruiker hulp heeft van een persoon met normale visus die de grafische voorstelling van de bladmuziek kan bekijken. Natuurlijk moeten deze programma's dan geïnstalleerd zijn op de PC.</w:t>
+        <w:t xml:space="preserve">De items 'MuseScore', 'Sibelius', 'Capella', 'Finale' </w:t>
+      </w:r>
+      <w:r>
+        <w:rPr>
+          <w:rFonts w:eastAsia="Calibri" w:cs="Verdana" w:ascii="Verdana" w:hAnsi="Verdana"/>
+          <w:lang w:val="en-GB" w:eastAsia="zh-CN"/>
+        </w:rPr>
+        <w:t xml:space="preserve">en  </w:t>
+      </w:r>
+      <w:r>
+        <w:rPr>
+          <w:rFonts w:eastAsia="Calibri" w:cs="Verdana" w:ascii="Verdana" w:hAnsi="Verdana"/>
+          <w:color w:val="C9211E"/>
+          <w:lang w:val="en-GB" w:eastAsia="zh-CN"/>
+        </w:rPr>
+        <w:t xml:space="preserve">"PhotoScore" and "Braille MusicEditor 2” </w:t>
+      </w:r>
+      <w:r>
+        <w:rPr>
+          <w:rFonts w:eastAsia="Calibri" w:cs="Verdana" w:ascii="Verdana" w:hAnsi="Verdana"/>
+          <w:lang w:val="en-GB" w:eastAsia="zh-CN"/>
+        </w:rPr>
+        <w:t>starten deze programma's waarbij ze gebruik maken van de het Muziek XML-bestand dat in IBOS XML-muzieklezer geopend is. Dit is een voordeel in situaties waarin de gebruiker hulp heeft van een persoon met normale visus die de grafische voorstelling van de bladmuziek kan bekijken. Natuurlijk moeten deze programma's dan geïnstalleerd zijn op de PC.</w:t>
       </w:r>
     </w:p>
     <w:p>
@@ -8893,15 +9428,15 @@
         <w:tblLook w:firstRow="1" w:noVBand="1" w:lastRow="0" w:firstColumn="1" w:lastColumn="0" w:noHBand="0" w:val="04a0"/>
       </w:tblPr>
       <w:tblGrid>
-        <w:gridCol w:w="3232"/>
+        <w:gridCol w:w="3231"/>
         <w:gridCol w:w="2309"/>
-        <w:gridCol w:w="3414"/>
+        <w:gridCol w:w="3415"/>
       </w:tblGrid>
       <w:tr>
         <w:trPr/>
         <w:tc>
           <w:tcPr>
-            <w:tcW w:w="3232" w:type="dxa"/>
+            <w:tcW w:w="3231" w:type="dxa"/>
             <w:tcBorders/>
             <w:shd w:color="auto" w:fill="auto" w:val="clear"/>
           </w:tcPr>
@@ -8943,7 +9478,7 @@
         </w:tc>
         <w:tc>
           <w:tcPr>
-            <w:tcW w:w="3414" w:type="dxa"/>
+            <w:tcW w:w="3415" w:type="dxa"/>
             <w:tcBorders/>
             <w:shd w:color="auto" w:fill="auto" w:val="clear"/>
           </w:tcPr>
@@ -8967,7 +9502,7 @@
         <w:trPr/>
         <w:tc>
           <w:tcPr>
-            <w:tcW w:w="3232" w:type="dxa"/>
+            <w:tcW w:w="3231" w:type="dxa"/>
             <w:tcBorders/>
             <w:shd w:color="auto" w:fill="auto" w:val="clear"/>
           </w:tcPr>
@@ -9010,7 +9545,7 @@
         </w:tc>
         <w:tc>
           <w:tcPr>
-            <w:tcW w:w="3414" w:type="dxa"/>
+            <w:tcW w:w="3415" w:type="dxa"/>
             <w:tcBorders/>
             <w:shd w:color="auto" w:fill="auto" w:val="clear"/>
           </w:tcPr>
@@ -9059,7 +9594,7 @@
         <w:trPr/>
         <w:tc>
           <w:tcPr>
-            <w:tcW w:w="3232" w:type="dxa"/>
+            <w:tcW w:w="3231" w:type="dxa"/>
             <w:tcBorders/>
             <w:shd w:color="auto" w:fill="auto" w:val="clear"/>
           </w:tcPr>
@@ -9118,7 +9653,7 @@
         </w:tc>
         <w:tc>
           <w:tcPr>
-            <w:tcW w:w="3414" w:type="dxa"/>
+            <w:tcW w:w="3415" w:type="dxa"/>
             <w:tcBorders/>
             <w:shd w:color="auto" w:fill="auto" w:val="clear"/>
           </w:tcPr>
@@ -9144,7 +9679,7 @@
         <w:trPr/>
         <w:tc>
           <w:tcPr>
-            <w:tcW w:w="3232" w:type="dxa"/>
+            <w:tcW w:w="3231" w:type="dxa"/>
             <w:tcBorders/>
             <w:shd w:color="auto" w:fill="auto" w:val="clear"/>
           </w:tcPr>
@@ -9187,7 +9722,7 @@
         </w:tc>
         <w:tc>
           <w:tcPr>
-            <w:tcW w:w="3414" w:type="dxa"/>
+            <w:tcW w:w="3415" w:type="dxa"/>
             <w:tcBorders/>
             <w:shd w:color="auto" w:fill="auto" w:val="clear"/>
           </w:tcPr>
@@ -9213,7 +9748,7 @@
         <w:trPr/>
         <w:tc>
           <w:tcPr>
-            <w:tcW w:w="3232" w:type="dxa"/>
+            <w:tcW w:w="3231" w:type="dxa"/>
             <w:tcBorders/>
             <w:shd w:color="auto" w:fill="auto" w:val="clear"/>
           </w:tcPr>
@@ -9256,7 +9791,7 @@
         </w:tc>
         <w:tc>
           <w:tcPr>
-            <w:tcW w:w="3414" w:type="dxa"/>
+            <w:tcW w:w="3415" w:type="dxa"/>
             <w:tcBorders/>
             <w:shd w:color="auto" w:fill="auto" w:val="clear"/>
           </w:tcPr>
@@ -9282,7 +9817,7 @@
         <w:trPr/>
         <w:tc>
           <w:tcPr>
-            <w:tcW w:w="3232" w:type="dxa"/>
+            <w:tcW w:w="3231" w:type="dxa"/>
             <w:tcBorders/>
             <w:shd w:color="auto" w:fill="auto" w:val="clear"/>
           </w:tcPr>
@@ -9328,7 +9863,7 @@
         </w:tc>
         <w:tc>
           <w:tcPr>
-            <w:tcW w:w="3414" w:type="dxa"/>
+            <w:tcW w:w="3415" w:type="dxa"/>
             <w:tcBorders/>
             <w:shd w:color="auto" w:fill="auto" w:val="clear"/>
           </w:tcPr>
@@ -9465,15 +10000,15 @@
         <w:tblLook w:firstRow="1" w:noVBand="1" w:lastRow="0" w:firstColumn="1" w:lastColumn="0" w:noHBand="0" w:val="04a0"/>
       </w:tblPr>
       <w:tblGrid>
-        <w:gridCol w:w="3232"/>
+        <w:gridCol w:w="3231"/>
         <w:gridCol w:w="2339"/>
-        <w:gridCol w:w="3444"/>
+        <w:gridCol w:w="3445"/>
       </w:tblGrid>
       <w:tr>
         <w:trPr/>
         <w:tc>
           <w:tcPr>
-            <w:tcW w:w="3232" w:type="dxa"/>
+            <w:tcW w:w="3231" w:type="dxa"/>
             <w:tcBorders/>
             <w:shd w:color="auto" w:fill="auto" w:val="clear"/>
           </w:tcPr>
@@ -9519,7 +10054,7 @@
         </w:tc>
         <w:tc>
           <w:tcPr>
-            <w:tcW w:w="3444" w:type="dxa"/>
+            <w:tcW w:w="3445" w:type="dxa"/>
             <w:tcBorders/>
             <w:shd w:color="auto" w:fill="auto" w:val="clear"/>
           </w:tcPr>
@@ -9545,7 +10080,7 @@
         <w:trPr/>
         <w:tc>
           <w:tcPr>
-            <w:tcW w:w="3232" w:type="dxa"/>
+            <w:tcW w:w="3231" w:type="dxa"/>
             <w:tcBorders/>
             <w:shd w:color="auto" w:fill="auto" w:val="clear"/>
           </w:tcPr>
@@ -9591,7 +10126,7 @@
         </w:tc>
         <w:tc>
           <w:tcPr>
-            <w:tcW w:w="3444" w:type="dxa"/>
+            <w:tcW w:w="3445" w:type="dxa"/>
             <w:tcBorders/>
             <w:shd w:color="auto" w:fill="auto" w:val="clear"/>
           </w:tcPr>
@@ -10074,14 +10609,14 @@
         <w:tblLook w:firstRow="1" w:noVBand="1" w:lastRow="0" w:firstColumn="1" w:lastColumn="0" w:noHBand="0" w:val="04a0"/>
       </w:tblPr>
       <w:tblGrid>
-        <w:gridCol w:w="1793"/>
-        <w:gridCol w:w="7161"/>
+        <w:gridCol w:w="1792"/>
+        <w:gridCol w:w="7162"/>
       </w:tblGrid>
       <w:tr>
         <w:trPr/>
         <w:tc>
           <w:tcPr>
-            <w:tcW w:w="1793" w:type="dxa"/>
+            <w:tcW w:w="1792" w:type="dxa"/>
             <w:tcBorders/>
             <w:shd w:color="auto" w:fill="auto" w:val="clear"/>
           </w:tcPr>
@@ -10104,7 +10639,7 @@
         </w:tc>
         <w:tc>
           <w:tcPr>
-            <w:tcW w:w="7161" w:type="dxa"/>
+            <w:tcW w:w="7162" w:type="dxa"/>
             <w:tcBorders/>
             <w:shd w:color="auto" w:fill="auto" w:val="clear"/>
           </w:tcPr>
@@ -10130,7 +10665,7 @@
         <w:trPr/>
         <w:tc>
           <w:tcPr>
-            <w:tcW w:w="1793" w:type="dxa"/>
+            <w:tcW w:w="1792" w:type="dxa"/>
             <w:tcBorders/>
             <w:shd w:color="auto" w:fill="auto" w:val="clear"/>
           </w:tcPr>
@@ -10151,7 +10686,7 @@
         </w:tc>
         <w:tc>
           <w:tcPr>
-            <w:tcW w:w="7161" w:type="dxa"/>
+            <w:tcW w:w="7162" w:type="dxa"/>
             <w:tcBorders/>
             <w:shd w:color="auto" w:fill="auto" w:val="clear"/>
           </w:tcPr>
@@ -10173,7 +10708,7 @@
         <w:trPr/>
         <w:tc>
           <w:tcPr>
-            <w:tcW w:w="1793" w:type="dxa"/>
+            <w:tcW w:w="1792" w:type="dxa"/>
             <w:tcBorders/>
             <w:shd w:color="auto" w:fill="auto" w:val="clear"/>
           </w:tcPr>
@@ -10194,7 +10729,7 @@
         </w:tc>
         <w:tc>
           <w:tcPr>
-            <w:tcW w:w="7161" w:type="dxa"/>
+            <w:tcW w:w="7162" w:type="dxa"/>
             <w:tcBorders/>
             <w:shd w:color="auto" w:fill="auto" w:val="clear"/>
           </w:tcPr>
@@ -10218,7 +10753,7 @@
         <w:trPr/>
         <w:tc>
           <w:tcPr>
-            <w:tcW w:w="1793" w:type="dxa"/>
+            <w:tcW w:w="1792" w:type="dxa"/>
             <w:tcBorders/>
             <w:shd w:color="auto" w:fill="auto" w:val="clear"/>
           </w:tcPr>
@@ -10239,7 +10774,7 @@
         </w:tc>
         <w:tc>
           <w:tcPr>
-            <w:tcW w:w="7161" w:type="dxa"/>
+            <w:tcW w:w="7162" w:type="dxa"/>
             <w:tcBorders/>
             <w:shd w:color="auto" w:fill="auto" w:val="clear"/>
           </w:tcPr>
@@ -10265,7 +10800,7 @@
         </w:trPr>
         <w:tc>
           <w:tcPr>
-            <w:tcW w:w="1793" w:type="dxa"/>
+            <w:tcW w:w="1792" w:type="dxa"/>
             <w:tcBorders/>
             <w:shd w:color="auto" w:fill="auto" w:val="clear"/>
           </w:tcPr>
@@ -10286,7 +10821,7 @@
         </w:tc>
         <w:tc>
           <w:tcPr>
-            <w:tcW w:w="7161" w:type="dxa"/>
+            <w:tcW w:w="7162" w:type="dxa"/>
             <w:tcBorders/>
             <w:shd w:color="auto" w:fill="auto" w:val="clear"/>
           </w:tcPr>
@@ -10310,7 +10845,7 @@
         <w:trPr/>
         <w:tc>
           <w:tcPr>
-            <w:tcW w:w="1793" w:type="dxa"/>
+            <w:tcW w:w="1792" w:type="dxa"/>
             <w:tcBorders/>
             <w:shd w:color="auto" w:fill="auto" w:val="clear"/>
           </w:tcPr>
@@ -10331,7 +10866,7 @@
         </w:tc>
         <w:tc>
           <w:tcPr>
-            <w:tcW w:w="7161" w:type="dxa"/>
+            <w:tcW w:w="7162" w:type="dxa"/>
             <w:tcBorders/>
             <w:shd w:color="auto" w:fill="auto" w:val="clear"/>
           </w:tcPr>
@@ -10353,7 +10888,7 @@
         <w:trPr/>
         <w:tc>
           <w:tcPr>
-            <w:tcW w:w="1793" w:type="dxa"/>
+            <w:tcW w:w="1792" w:type="dxa"/>
             <w:tcBorders/>
             <w:shd w:color="auto" w:fill="auto" w:val="clear"/>
           </w:tcPr>
@@ -10374,7 +10909,7 @@
         </w:tc>
         <w:tc>
           <w:tcPr>
-            <w:tcW w:w="7161" w:type="dxa"/>
+            <w:tcW w:w="7162" w:type="dxa"/>
             <w:tcBorders/>
             <w:shd w:color="auto" w:fill="auto" w:val="clear"/>
           </w:tcPr>
@@ -10412,7 +10947,7 @@
         <w:trPr/>
         <w:tc>
           <w:tcPr>
-            <w:tcW w:w="1793" w:type="dxa"/>
+            <w:tcW w:w="1792" w:type="dxa"/>
             <w:tcBorders/>
             <w:shd w:color="auto" w:fill="auto" w:val="clear"/>
           </w:tcPr>
@@ -10433,7 +10968,7 @@
         </w:tc>
         <w:tc>
           <w:tcPr>
-            <w:tcW w:w="7161" w:type="dxa"/>
+            <w:tcW w:w="7162" w:type="dxa"/>
             <w:tcBorders/>
             <w:shd w:color="auto" w:fill="auto" w:val="clear"/>
           </w:tcPr>
@@ -10533,14 +11068,14 @@
         <w:tblLook w:firstRow="1" w:noVBand="1" w:lastRow="0" w:firstColumn="1" w:lastColumn="0" w:noHBand="0" w:val="04a0"/>
       </w:tblPr>
       <w:tblGrid>
-        <w:gridCol w:w="3055"/>
-        <w:gridCol w:w="6589"/>
+        <w:gridCol w:w="3054"/>
+        <w:gridCol w:w="6590"/>
       </w:tblGrid>
       <w:tr>
         <w:trPr/>
         <w:tc>
           <w:tcPr>
-            <w:tcW w:w="3055" w:type="dxa"/>
+            <w:tcW w:w="3054" w:type="dxa"/>
             <w:tcBorders/>
             <w:shd w:color="auto" w:fill="auto" w:val="clear"/>
           </w:tcPr>
@@ -10561,7 +11096,7 @@
         </w:tc>
         <w:tc>
           <w:tcPr>
-            <w:tcW w:w="6589" w:type="dxa"/>
+            <w:tcW w:w="6590" w:type="dxa"/>
             <w:tcBorders/>
             <w:shd w:color="auto" w:fill="auto" w:val="clear"/>
           </w:tcPr>
@@ -10585,7 +11120,7 @@
         <w:trPr/>
         <w:tc>
           <w:tcPr>
-            <w:tcW w:w="3055" w:type="dxa"/>
+            <w:tcW w:w="3054" w:type="dxa"/>
             <w:tcBorders/>
             <w:shd w:color="auto" w:fill="auto" w:val="clear"/>
           </w:tcPr>
@@ -10606,7 +11141,7 @@
         </w:tc>
         <w:tc>
           <w:tcPr>
-            <w:tcW w:w="6589" w:type="dxa"/>
+            <w:tcW w:w="6590" w:type="dxa"/>
             <w:tcBorders/>
             <w:shd w:color="auto" w:fill="auto" w:val="clear"/>
           </w:tcPr>
@@ -10628,7 +11163,7 @@
         <w:trPr/>
         <w:tc>
           <w:tcPr>
-            <w:tcW w:w="3055" w:type="dxa"/>
+            <w:tcW w:w="3054" w:type="dxa"/>
             <w:tcBorders/>
             <w:shd w:color="auto" w:fill="auto" w:val="clear"/>
           </w:tcPr>
@@ -10647,7 +11182,7 @@
         </w:tc>
         <w:tc>
           <w:tcPr>
-            <w:tcW w:w="6589" w:type="dxa"/>
+            <w:tcW w:w="6590" w:type="dxa"/>
             <w:tcBorders/>
             <w:shd w:color="auto" w:fill="auto" w:val="clear"/>
           </w:tcPr>
@@ -10669,7 +11204,7 @@
         <w:trPr/>
         <w:tc>
           <w:tcPr>
-            <w:tcW w:w="3055" w:type="dxa"/>
+            <w:tcW w:w="3054" w:type="dxa"/>
             <w:tcBorders/>
             <w:shd w:color="auto" w:fill="auto" w:val="clear"/>
           </w:tcPr>
@@ -10690,7 +11225,7 @@
         </w:tc>
         <w:tc>
           <w:tcPr>
-            <w:tcW w:w="6589" w:type="dxa"/>
+            <w:tcW w:w="6590" w:type="dxa"/>
             <w:tcBorders/>
             <w:shd w:color="auto" w:fill="auto" w:val="clear"/>
           </w:tcPr>
@@ -12390,6 +12925,8 @@
         <w:rPr>
           <w:rFonts w:ascii="Verdana" w:hAnsi="Verdana" w:cs="Verdana"/>
           <w:b w:val="false"/>
+          <w:b w:val="false"/>
+          <w:i w:val="false"/>
           <w:i w:val="false"/>
           <w:caps w:val="false"/>
           <w:smallCaps w:val="false"/>
@@ -12402,17 +12939,6 @@
           <w:u w:val="none"/>
           <w:effect w:val="none"/>
         </w:rPr>
-      </w:pPr>
-      <w:r>
-        <w:rPr/>
-      </w:r>
-    </w:p>
-    <w:p>
-      <w:pPr>
-        <w:pStyle w:val="Normal"/>
-        <w:ind w:left="0" w:right="0" w:hanging="0"/>
-        <w:jc w:val="left"/>
-        <w:rPr/>
       </w:pPr>
       <w:r>
         <w:rPr>
@@ -12430,20 +12956,44 @@
           <w:u w:val="none"/>
           <w:effect w:val="none"/>
         </w:rPr>
-        <w:t>Er is een optie bij "import de downloads van vandaag", namelijk "ïmporteer downloads", waardoor in detail gekozen kan worden welke bestanden geïmporteerd worden"  </w:t>
-      </w:r>
-    </w:p>
-    <w:p>
-      <w:pPr>
-        <w:pStyle w:val="Normal"/>
-        <w:rPr>
-          <w:rFonts w:ascii="Verdana" w:hAnsi="Verdana" w:cs="Verdana"/>
-        </w:rPr>
-      </w:pPr>
-      <w:r>
-        <w:rPr>
+      </w:r>
+    </w:p>
+    <w:p>
+      <w:pPr>
+        <w:pStyle w:val="Normal"/>
+        <w:ind w:left="0" w:right="0" w:hanging="0"/>
+        <w:jc w:val="left"/>
+        <w:rPr/>
+      </w:pPr>
+      <w:r>
+        <w:rPr>
+          <w:rFonts w:cs="Verdana" w:ascii="Verdana" w:hAnsi="Verdana"/>
+          <w:b w:val="false"/>
+          <w:i w:val="false"/>
+          <w:caps w:val="false"/>
+          <w:smallCaps w:val="false"/>
+          <w:strike w:val="false"/>
+          <w:dstrike w:val="false"/>
+          <w:color w:val="333333"/>
+          <w:spacing w:val="0"/>
           <w:sz w:val="22"/>
           <w:szCs w:val="22"/>
+          <w:u w:val="none"/>
+          <w:effect w:val="none"/>
+        </w:rPr>
+        <w:t>Er is een optie bij "import de downloads van vandaag", namelijk "ïmporteer downloads", waardoor in detail gekozen kan worden welke bestanden geïmporteerd worden"  </w:t>
+      </w:r>
+    </w:p>
+    <w:p>
+      <w:pPr>
+        <w:pStyle w:val="Normal"/>
+        <w:rPr>
+          <w:rFonts w:ascii="Verdana" w:hAnsi="Verdana" w:cs="Verdana"/>
+        </w:rPr>
+      </w:pPr>
+      <w:r>
+        <w:rPr>
+          <w:rFonts w:cs="Verdana" w:ascii="Verdana" w:hAnsi="Verdana"/>
         </w:rPr>
       </w:r>
     </w:p>
@@ -13011,7 +13561,45 @@
         <w:rPr>
           <w:rFonts w:cs="Verdana" w:ascii="Verdana" w:hAnsi="Verdana"/>
         </w:rPr>
-        <w:t>Versie 4.0 ondersteunt “Braille printer”, “Notetaker” and “Algemene braille printer”.</w:t>
+        <w:t xml:space="preserve">Versie </w:t>
+      </w:r>
+      <w:r>
+        <w:rPr>
+          <w:rFonts w:cs="Verdana" w:ascii="Verdana" w:hAnsi="Verdana"/>
+        </w:rPr>
+        <w:t>5</w:t>
+      </w:r>
+      <w:r>
+        <w:rPr>
+          <w:rFonts w:cs="Verdana" w:ascii="Verdana" w:hAnsi="Verdana"/>
+        </w:rPr>
+        <w:t xml:space="preserve">.0 ondersteunt “Braille printer”, “Notetaker”, </w:t>
+      </w:r>
+      <w:r>
+        <w:rPr>
+          <w:rFonts w:cs="Verdana" w:ascii="Verdana" w:hAnsi="Verdana"/>
+          <w:color w:val="C9211E"/>
+        </w:rPr>
+        <w:t>“Braillo 650 SF”</w:t>
+      </w:r>
+      <w:r>
+        <w:rPr>
+          <w:rFonts w:cs="Verdana" w:ascii="Verdana" w:hAnsi="Verdana"/>
+        </w:rPr>
+        <w:t xml:space="preserve"> and “Algemene braille printer”.</w:t>
+      </w:r>
+    </w:p>
+    <w:p>
+      <w:pPr>
+        <w:pStyle w:val="Normal"/>
+        <w:rPr/>
+      </w:pPr>
+      <w:r>
+        <w:rPr>
+          <w:rFonts w:cs="Verdana" w:ascii="Verdana" w:hAnsi="Verdana"/>
+          <w:color w:val="C9211E"/>
+        </w:rPr>
+        <w:t>The user can change the names of the devices, for instance to the name of the user’s own, specific embosser.</w:t>
       </w:r>
     </w:p>
     <w:p>
@@ -13021,11 +13609,7 @@
           <w:ilvl w:val="2"/>
           <w:numId w:val="2"/>
         </w:numPr>
-        <w:rPr>
-          <w:rFonts w:ascii="Verdana" w:hAnsi="Verdana"/>
-          <w:sz w:val="28"/>
-          <w:szCs w:val="28"/>
-        </w:rPr>
+        <w:rPr/>
       </w:pPr>
       <w:bookmarkStart w:id="30" w:name="_Toc31150881"/>
       <w:r>
@@ -13282,6 +13866,58 @@
           <w:p>
             <w:pPr>
               <w:pStyle w:val="Tabelindhold"/>
+              <w:jc w:val="left"/>
+              <w:rPr/>
+            </w:pPr>
+            <w:r>
+              <w:rPr>
+                <w:rFonts w:ascii="Liberation Serif" w:hAnsi="Liberation Serif"/>
+                <w:color w:val="C9211E"/>
+              </w:rPr>
+              <w:t>High speed embosser</w:t>
+            </w:r>
+          </w:p>
+        </w:tc>
+        <w:tc>
+          <w:tcPr>
+            <w:tcW w:w="6421" w:type="dxa"/>
+            <w:tcBorders>
+              <w:left w:val="single" w:sz="4" w:space="0" w:color="000000"/>
+              <w:bottom w:val="single" w:sz="4" w:space="0" w:color="000000"/>
+              <w:right w:val="single" w:sz="4" w:space="0" w:color="000000"/>
+            </w:tcBorders>
+            <w:shd w:color="auto" w:fill="auto" w:val="clear"/>
+          </w:tcPr>
+          <w:p>
+            <w:pPr>
+              <w:pStyle w:val="Tabelindhold"/>
+              <w:jc w:val="left"/>
+              <w:rPr/>
+            </w:pPr>
+            <w:r>
+              <w:rPr>
+                <w:rFonts w:ascii="Liberation Serif" w:hAnsi="Liberation Serif"/>
+                <w:color w:val="C9211E"/>
+              </w:rPr>
+              <w:t>Typical parameters for a high speed embosser. The name “Braille 650 SF” is the name of the high speed embosser used by the NOTA institute in Denmark</w:t>
+            </w:r>
+          </w:p>
+        </w:tc>
+      </w:tr>
+      <w:tr>
+        <w:trPr/>
+        <w:tc>
+          <w:tcPr>
+            <w:tcW w:w="2604" w:type="dxa"/>
+            <w:tcBorders>
+              <w:left w:val="single" w:sz="4" w:space="0" w:color="000000"/>
+              <w:bottom w:val="single" w:sz="4" w:space="0" w:color="000000"/>
+            </w:tcBorders>
+            <w:shd w:color="auto" w:fill="auto" w:val="clear"/>
+          </w:tcPr>
+          <w:p>
+            <w:pPr>
+              <w:pStyle w:val="Tabelindhold"/>
               <w:rPr>
                 <w:rFonts w:ascii="Liberation Serif" w:hAnsi="Liberation Serif"/>
                 <w:color w:val="000000"/>
@@ -13782,15 +14418,26 @@
     <w:p>
       <w:pPr>
         <w:pStyle w:val="Normal"/>
-        <w:rPr>
-          <w:rFonts w:ascii="Verdana" w:hAnsi="Verdana" w:cs="Verdana"/>
-        </w:rPr>
+        <w:rPr/>
       </w:pPr>
       <w:r>
         <w:rPr>
           <w:rFonts w:cs="Verdana" w:ascii="Verdana" w:hAnsi="Verdana"/>
         </w:rPr>
         <w:t>Standaard worden de braille muziekbestanden opgeslagen worden in een submap van het MusixcXML-bestand, maar vaak is het comfortabeler om het bestand direct op te slaan op een USB stick, die direct aan de notetaker wordt aangesloten of gebruikt wordt door een programma dat in staat is braillemuziek op een brailleprinter te printen.</w:t>
+      </w:r>
+    </w:p>
+    <w:p>
+      <w:pPr>
+        <w:pStyle w:val="Normal"/>
+        <w:rPr/>
+      </w:pPr>
+      <w:r>
+        <w:rPr>
+          <w:rFonts w:cs="Verdana" w:ascii="Verdana" w:hAnsi="Verdana"/>
+          <w:color w:val="C9211E"/>
+        </w:rPr>
+        <w:t>Starting with version 5.0.0.0 the user can also browse the contents of the Music Braille files generated by opening them one at a time by “IBOS Music Braille Reader”</w:t>
       </w:r>
     </w:p>
     <w:p>
@@ -15241,14 +15888,14 @@
         <w:tblLook w:firstRow="1" w:noVBand="1" w:lastRow="0" w:firstColumn="1" w:lastColumn="0" w:noHBand="0" w:val="04a0"/>
       </w:tblPr>
       <w:tblGrid>
-        <w:gridCol w:w="3055"/>
-        <w:gridCol w:w="6589"/>
+        <w:gridCol w:w="3054"/>
+        <w:gridCol w:w="6590"/>
       </w:tblGrid>
       <w:tr>
         <w:trPr/>
         <w:tc>
           <w:tcPr>
-            <w:tcW w:w="3055" w:type="dxa"/>
+            <w:tcW w:w="3054" w:type="dxa"/>
             <w:tcBorders/>
             <w:shd w:color="auto" w:fill="auto" w:val="clear"/>
           </w:tcPr>
@@ -15273,7 +15920,7 @@
         </w:tc>
         <w:tc>
           <w:tcPr>
-            <w:tcW w:w="6589" w:type="dxa"/>
+            <w:tcW w:w="6590" w:type="dxa"/>
             <w:tcBorders/>
             <w:shd w:color="auto" w:fill="auto" w:val="clear"/>
           </w:tcPr>
@@ -15299,7 +15946,7 @@
         <w:trPr/>
         <w:tc>
           <w:tcPr>
-            <w:tcW w:w="3055" w:type="dxa"/>
+            <w:tcW w:w="3054" w:type="dxa"/>
             <w:tcBorders/>
             <w:shd w:color="auto" w:fill="auto" w:val="clear"/>
           </w:tcPr>
@@ -15322,7 +15969,7 @@
         </w:tc>
         <w:tc>
           <w:tcPr>
-            <w:tcW w:w="6589" w:type="dxa"/>
+            <w:tcW w:w="6590" w:type="dxa"/>
             <w:tcBorders/>
             <w:shd w:color="auto" w:fill="auto" w:val="clear"/>
           </w:tcPr>
@@ -15350,7 +15997,7 @@
         <w:trPr/>
         <w:tc>
           <w:tcPr>
-            <w:tcW w:w="3055" w:type="dxa"/>
+            <w:tcW w:w="3054" w:type="dxa"/>
             <w:tcBorders/>
             <w:shd w:color="auto" w:fill="auto" w:val="clear"/>
           </w:tcPr>
@@ -15374,7 +16021,7 @@
         </w:tc>
         <w:tc>
           <w:tcPr>
-            <w:tcW w:w="6589" w:type="dxa"/>
+            <w:tcW w:w="6590" w:type="dxa"/>
             <w:tcBorders/>
             <w:shd w:color="auto" w:fill="auto" w:val="clear"/>
           </w:tcPr>
@@ -15401,7 +16048,7 @@
         <w:trPr/>
         <w:tc>
           <w:tcPr>
-            <w:tcW w:w="3055" w:type="dxa"/>
+            <w:tcW w:w="3054" w:type="dxa"/>
             <w:tcBorders/>
             <w:shd w:color="auto" w:fill="auto" w:val="clear"/>
           </w:tcPr>
@@ -15425,7 +16072,7 @@
         </w:tc>
         <w:tc>
           <w:tcPr>
-            <w:tcW w:w="6589" w:type="dxa"/>
+            <w:tcW w:w="6590" w:type="dxa"/>
             <w:tcBorders/>
             <w:shd w:color="auto" w:fill="auto" w:val="clear"/>
           </w:tcPr>
@@ -15453,7 +16100,7 @@
         <w:trPr/>
         <w:tc>
           <w:tcPr>
-            <w:tcW w:w="3055" w:type="dxa"/>
+            <w:tcW w:w="3054" w:type="dxa"/>
             <w:tcBorders/>
             <w:shd w:color="auto" w:fill="auto" w:val="clear"/>
           </w:tcPr>
@@ -15478,7 +16125,7 @@
         </w:tc>
         <w:tc>
           <w:tcPr>
-            <w:tcW w:w="6589" w:type="dxa"/>
+            <w:tcW w:w="6590" w:type="dxa"/>
             <w:tcBorders/>
             <w:shd w:color="auto" w:fill="auto" w:val="clear"/>
           </w:tcPr>
@@ -15506,7 +16153,7 @@
         <w:trPr/>
         <w:tc>
           <w:tcPr>
-            <w:tcW w:w="3055" w:type="dxa"/>
+            <w:tcW w:w="3054" w:type="dxa"/>
             <w:tcBorders/>
             <w:shd w:color="auto" w:fill="auto" w:val="clear"/>
           </w:tcPr>
@@ -15527,7 +16174,7 @@
         </w:tc>
         <w:tc>
           <w:tcPr>
-            <w:tcW w:w="6589" w:type="dxa"/>
+            <w:tcW w:w="6590" w:type="dxa"/>
             <w:tcBorders/>
             <w:shd w:color="auto" w:fill="auto" w:val="clear"/>
           </w:tcPr>
@@ -15553,7 +16200,7 @@
         <w:trPr/>
         <w:tc>
           <w:tcPr>
-            <w:tcW w:w="3055" w:type="dxa"/>
+            <w:tcW w:w="3054" w:type="dxa"/>
             <w:tcBorders/>
             <w:shd w:color="auto" w:fill="auto" w:val="clear"/>
           </w:tcPr>
@@ -15578,7 +16225,7 @@
         </w:tc>
         <w:tc>
           <w:tcPr>
-            <w:tcW w:w="6589" w:type="dxa"/>
+            <w:tcW w:w="6590" w:type="dxa"/>
             <w:tcBorders/>
             <w:shd w:color="auto" w:fill="auto" w:val="clear"/>
           </w:tcPr>
@@ -15601,7 +16248,7 @@
         <w:trPr/>
         <w:tc>
           <w:tcPr>
-            <w:tcW w:w="3055" w:type="dxa"/>
+            <w:tcW w:w="3054" w:type="dxa"/>
             <w:tcBorders/>
             <w:shd w:color="auto" w:fill="auto" w:val="clear"/>
           </w:tcPr>
@@ -15624,7 +16271,7 @@
         </w:tc>
         <w:tc>
           <w:tcPr>
-            <w:tcW w:w="6589" w:type="dxa"/>
+            <w:tcW w:w="6590" w:type="dxa"/>
             <w:tcBorders/>
             <w:shd w:color="auto" w:fill="auto" w:val="clear"/>
           </w:tcPr>
@@ -15647,7 +16294,7 @@
         <w:trPr/>
         <w:tc>
           <w:tcPr>
-            <w:tcW w:w="3055" w:type="dxa"/>
+            <w:tcW w:w="3054" w:type="dxa"/>
             <w:tcBorders/>
             <w:shd w:color="auto" w:fill="auto" w:val="clear"/>
           </w:tcPr>
@@ -15667,7 +16314,7 @@
         </w:tc>
         <w:tc>
           <w:tcPr>
-            <w:tcW w:w="6589" w:type="dxa"/>
+            <w:tcW w:w="6590" w:type="dxa"/>
             <w:tcBorders/>
             <w:shd w:color="auto" w:fill="auto" w:val="clear"/>
           </w:tcPr>
@@ -15690,7 +16337,7 @@
         <w:trPr/>
         <w:tc>
           <w:tcPr>
-            <w:tcW w:w="3055" w:type="dxa"/>
+            <w:tcW w:w="3054" w:type="dxa"/>
             <w:tcBorders/>
             <w:shd w:color="auto" w:fill="auto" w:val="clear"/>
           </w:tcPr>
@@ -15713,7 +16360,7 @@
         </w:tc>
         <w:tc>
           <w:tcPr>
-            <w:tcW w:w="6589" w:type="dxa"/>
+            <w:tcW w:w="6590" w:type="dxa"/>
             <w:tcBorders/>
             <w:shd w:color="auto" w:fill="auto" w:val="clear"/>
           </w:tcPr>
@@ -15739,7 +16386,7 @@
         <w:trPr/>
         <w:tc>
           <w:tcPr>
-            <w:tcW w:w="3055" w:type="dxa"/>
+            <w:tcW w:w="3054" w:type="dxa"/>
             <w:tcBorders/>
             <w:shd w:color="auto" w:fill="auto" w:val="clear"/>
           </w:tcPr>
@@ -15762,7 +16409,7 @@
         </w:tc>
         <w:tc>
           <w:tcPr>
-            <w:tcW w:w="6589" w:type="dxa"/>
+            <w:tcW w:w="6590" w:type="dxa"/>
             <w:tcBorders/>
             <w:shd w:color="auto" w:fill="auto" w:val="clear"/>
           </w:tcPr>
@@ -15788,7 +16435,7 @@
         <w:trPr/>
         <w:tc>
           <w:tcPr>
-            <w:tcW w:w="3055" w:type="dxa"/>
+            <w:tcW w:w="3054" w:type="dxa"/>
             <w:tcBorders/>
             <w:shd w:color="auto" w:fill="auto" w:val="clear"/>
           </w:tcPr>
@@ -15811,7 +16458,7 @@
         </w:tc>
         <w:tc>
           <w:tcPr>
-            <w:tcW w:w="6589" w:type="dxa"/>
+            <w:tcW w:w="6590" w:type="dxa"/>
             <w:tcBorders/>
             <w:shd w:color="auto" w:fill="auto" w:val="clear"/>
           </w:tcPr>
@@ -15837,7 +16484,7 @@
         <w:trPr/>
         <w:tc>
           <w:tcPr>
-            <w:tcW w:w="3055" w:type="dxa"/>
+            <w:tcW w:w="3054" w:type="dxa"/>
             <w:tcBorders/>
             <w:shd w:color="auto" w:fill="auto" w:val="clear"/>
           </w:tcPr>
@@ -15860,7 +16507,7 @@
         </w:tc>
         <w:tc>
           <w:tcPr>
-            <w:tcW w:w="6589" w:type="dxa"/>
+            <w:tcW w:w="6590" w:type="dxa"/>
             <w:tcBorders/>
             <w:shd w:color="auto" w:fill="auto" w:val="clear"/>
           </w:tcPr>
@@ -15886,7 +16533,7 @@
         <w:trPr/>
         <w:tc>
           <w:tcPr>
-            <w:tcW w:w="3055" w:type="dxa"/>
+            <w:tcW w:w="3054" w:type="dxa"/>
             <w:tcBorders/>
             <w:shd w:color="auto" w:fill="auto" w:val="clear"/>
           </w:tcPr>
@@ -15909,7 +16556,7 @@
         </w:tc>
         <w:tc>
           <w:tcPr>
-            <w:tcW w:w="6589" w:type="dxa"/>
+            <w:tcW w:w="6590" w:type="dxa"/>
             <w:tcBorders/>
             <w:shd w:color="auto" w:fill="auto" w:val="clear"/>
           </w:tcPr>
@@ -15937,7 +16584,7 @@
         <w:trPr/>
         <w:tc>
           <w:tcPr>
-            <w:tcW w:w="3055" w:type="dxa"/>
+            <w:tcW w:w="3054" w:type="dxa"/>
             <w:tcBorders/>
             <w:shd w:color="auto" w:fill="auto" w:val="clear"/>
           </w:tcPr>
@@ -15960,7 +16607,7 @@
         </w:tc>
         <w:tc>
           <w:tcPr>
-            <w:tcW w:w="6589" w:type="dxa"/>
+            <w:tcW w:w="6590" w:type="dxa"/>
             <w:tcBorders/>
             <w:shd w:color="auto" w:fill="auto" w:val="clear"/>
           </w:tcPr>
@@ -15983,7 +16630,7 @@
         <w:trPr/>
         <w:tc>
           <w:tcPr>
-            <w:tcW w:w="3055" w:type="dxa"/>
+            <w:tcW w:w="3054" w:type="dxa"/>
             <w:tcBorders/>
             <w:shd w:color="auto" w:fill="auto" w:val="clear"/>
           </w:tcPr>
@@ -16006,7 +16653,7 @@
         </w:tc>
         <w:tc>
           <w:tcPr>
-            <w:tcW w:w="6589" w:type="dxa"/>
+            <w:tcW w:w="6590" w:type="dxa"/>
             <w:tcBorders/>
             <w:shd w:color="auto" w:fill="auto" w:val="clear"/>
           </w:tcPr>
@@ -16029,7 +16676,7 @@
         <w:trPr/>
         <w:tc>
           <w:tcPr>
-            <w:tcW w:w="3055" w:type="dxa"/>
+            <w:tcW w:w="3054" w:type="dxa"/>
             <w:tcBorders/>
             <w:shd w:color="auto" w:fill="auto" w:val="clear"/>
           </w:tcPr>
@@ -16054,7 +16701,7 @@
         </w:tc>
         <w:tc>
           <w:tcPr>
-            <w:tcW w:w="6589" w:type="dxa"/>
+            <w:tcW w:w="6590" w:type="dxa"/>
             <w:tcBorders/>
             <w:shd w:color="auto" w:fill="auto" w:val="clear"/>
           </w:tcPr>
@@ -16077,7 +16724,7 @@
         <w:trPr/>
         <w:tc>
           <w:tcPr>
-            <w:tcW w:w="3055" w:type="dxa"/>
+            <w:tcW w:w="3054" w:type="dxa"/>
             <w:tcBorders/>
             <w:shd w:color="auto" w:fill="auto" w:val="clear"/>
           </w:tcPr>
@@ -16100,7 +16747,7 @@
         </w:tc>
         <w:tc>
           <w:tcPr>
-            <w:tcW w:w="6589" w:type="dxa"/>
+            <w:tcW w:w="6590" w:type="dxa"/>
             <w:tcBorders/>
             <w:shd w:color="auto" w:fill="auto" w:val="clear"/>
           </w:tcPr>
@@ -16123,7 +16770,7 @@
         <w:trPr/>
         <w:tc>
           <w:tcPr>
-            <w:tcW w:w="3055" w:type="dxa"/>
+            <w:tcW w:w="3054" w:type="dxa"/>
             <w:tcBorders/>
             <w:shd w:color="auto" w:fill="auto" w:val="clear"/>
           </w:tcPr>
@@ -16146,7 +16793,7 @@
         </w:tc>
         <w:tc>
           <w:tcPr>
-            <w:tcW w:w="6589" w:type="dxa"/>
+            <w:tcW w:w="6590" w:type="dxa"/>
             <w:tcBorders/>
             <w:shd w:color="auto" w:fill="auto" w:val="clear"/>
           </w:tcPr>
@@ -16172,7 +16819,7 @@
         <w:trPr/>
         <w:tc>
           <w:tcPr>
-            <w:tcW w:w="3055" w:type="dxa"/>
+            <w:tcW w:w="3054" w:type="dxa"/>
             <w:tcBorders/>
             <w:shd w:color="auto" w:fill="auto" w:val="clear"/>
           </w:tcPr>
@@ -16195,7 +16842,7 @@
         </w:tc>
         <w:tc>
           <w:tcPr>
-            <w:tcW w:w="6589" w:type="dxa"/>
+            <w:tcW w:w="6590" w:type="dxa"/>
             <w:tcBorders/>
             <w:shd w:color="auto" w:fill="auto" w:val="clear"/>
           </w:tcPr>
@@ -16218,7 +16865,7 @@
         <w:trPr/>
         <w:tc>
           <w:tcPr>
-            <w:tcW w:w="3055" w:type="dxa"/>
+            <w:tcW w:w="3054" w:type="dxa"/>
             <w:tcBorders/>
             <w:shd w:color="auto" w:fill="auto" w:val="clear"/>
           </w:tcPr>
@@ -16241,7 +16888,7 @@
         </w:tc>
         <w:tc>
           <w:tcPr>
-            <w:tcW w:w="6589" w:type="dxa"/>
+            <w:tcW w:w="6590" w:type="dxa"/>
             <w:tcBorders/>
             <w:shd w:color="auto" w:fill="auto" w:val="clear"/>
           </w:tcPr>
@@ -16267,7 +16914,7 @@
         <w:trPr/>
         <w:tc>
           <w:tcPr>
-            <w:tcW w:w="3055" w:type="dxa"/>
+            <w:tcW w:w="3054" w:type="dxa"/>
             <w:tcBorders/>
             <w:shd w:color="auto" w:fill="auto" w:val="clear"/>
           </w:tcPr>
@@ -16292,7 +16939,7 @@
         </w:tc>
         <w:tc>
           <w:tcPr>
-            <w:tcW w:w="6589" w:type="dxa"/>
+            <w:tcW w:w="6590" w:type="dxa"/>
             <w:tcBorders/>
             <w:shd w:color="auto" w:fill="auto" w:val="clear"/>
           </w:tcPr>
@@ -16316,7 +16963,7 @@
         <w:trPr/>
         <w:tc>
           <w:tcPr>
-            <w:tcW w:w="3055" w:type="dxa"/>
+            <w:tcW w:w="3054" w:type="dxa"/>
             <w:tcBorders/>
             <w:shd w:color="auto" w:fill="auto" w:val="clear"/>
           </w:tcPr>
@@ -16341,7 +16988,7 @@
         </w:tc>
         <w:tc>
           <w:tcPr>
-            <w:tcW w:w="6589" w:type="dxa"/>
+            <w:tcW w:w="6590" w:type="dxa"/>
             <w:tcBorders/>
             <w:shd w:color="auto" w:fill="auto" w:val="clear"/>
           </w:tcPr>
@@ -16423,14 +17070,14 @@
         <w:tblLook w:firstRow="1" w:noVBand="1" w:lastRow="0" w:firstColumn="1" w:lastColumn="0" w:noHBand="0" w:val="04a0"/>
       </w:tblPr>
       <w:tblGrid>
-        <w:gridCol w:w="2153"/>
-        <w:gridCol w:w="6801"/>
+        <w:gridCol w:w="2152"/>
+        <w:gridCol w:w="6802"/>
       </w:tblGrid>
       <w:tr>
         <w:trPr/>
         <w:tc>
           <w:tcPr>
-            <w:tcW w:w="2153" w:type="dxa"/>
+            <w:tcW w:w="2152" w:type="dxa"/>
             <w:tcBorders/>
             <w:shd w:color="auto" w:fill="auto" w:val="clear"/>
           </w:tcPr>
@@ -16455,7 +17102,7 @@
         </w:tc>
         <w:tc>
           <w:tcPr>
-            <w:tcW w:w="6801" w:type="dxa"/>
+            <w:tcW w:w="6802" w:type="dxa"/>
             <w:tcBorders/>
             <w:shd w:color="auto" w:fill="auto" w:val="clear"/>
           </w:tcPr>
@@ -16481,7 +17128,7 @@
         <w:trPr/>
         <w:tc>
           <w:tcPr>
-            <w:tcW w:w="2153" w:type="dxa"/>
+            <w:tcW w:w="2152" w:type="dxa"/>
             <w:tcBorders/>
             <w:shd w:color="auto" w:fill="auto" w:val="clear"/>
           </w:tcPr>
@@ -16502,7 +17149,7 @@
         </w:tc>
         <w:tc>
           <w:tcPr>
-            <w:tcW w:w="6801" w:type="dxa"/>
+            <w:tcW w:w="6802" w:type="dxa"/>
             <w:tcBorders/>
             <w:shd w:color="auto" w:fill="auto" w:val="clear"/>
           </w:tcPr>
@@ -16526,7 +17173,7 @@
         <w:trPr/>
         <w:tc>
           <w:tcPr>
-            <w:tcW w:w="2153" w:type="dxa"/>
+            <w:tcW w:w="2152" w:type="dxa"/>
             <w:tcBorders/>
             <w:shd w:color="auto" w:fill="auto" w:val="clear"/>
           </w:tcPr>
@@ -16549,7 +17196,7 @@
         </w:tc>
         <w:tc>
           <w:tcPr>
-            <w:tcW w:w="6801" w:type="dxa"/>
+            <w:tcW w:w="6802" w:type="dxa"/>
             <w:tcBorders/>
             <w:shd w:color="auto" w:fill="auto" w:val="clear"/>
           </w:tcPr>
@@ -16573,7 +17220,7 @@
         <w:trPr/>
         <w:tc>
           <w:tcPr>
-            <w:tcW w:w="2153" w:type="dxa"/>
+            <w:tcW w:w="2152" w:type="dxa"/>
             <w:tcBorders/>
             <w:shd w:color="auto" w:fill="auto" w:val="clear"/>
           </w:tcPr>
@@ -16596,7 +17243,7 @@
         </w:tc>
         <w:tc>
           <w:tcPr>
-            <w:tcW w:w="6801" w:type="dxa"/>
+            <w:tcW w:w="6802" w:type="dxa"/>
             <w:tcBorders/>
             <w:shd w:color="auto" w:fill="auto" w:val="clear"/>
           </w:tcPr>
@@ -16621,7 +17268,7 @@
         <w:trPr/>
         <w:tc>
           <w:tcPr>
-            <w:tcW w:w="2153" w:type="dxa"/>
+            <w:tcW w:w="2152" w:type="dxa"/>
             <w:tcBorders/>
             <w:shd w:color="auto" w:fill="auto" w:val="clear"/>
           </w:tcPr>
@@ -16644,7 +17291,7 @@
         </w:tc>
         <w:tc>
           <w:tcPr>
-            <w:tcW w:w="6801" w:type="dxa"/>
+            <w:tcW w:w="6802" w:type="dxa"/>
             <w:tcBorders/>
             <w:shd w:color="auto" w:fill="auto" w:val="clear"/>
           </w:tcPr>
@@ -16668,7 +17315,7 @@
         <w:trPr/>
         <w:tc>
           <w:tcPr>
-            <w:tcW w:w="2153" w:type="dxa"/>
+            <w:tcW w:w="2152" w:type="dxa"/>
             <w:tcBorders/>
             <w:shd w:color="auto" w:fill="auto" w:val="clear"/>
           </w:tcPr>
@@ -16691,7 +17338,7 @@
         </w:tc>
         <w:tc>
           <w:tcPr>
-            <w:tcW w:w="6801" w:type="dxa"/>
+            <w:tcW w:w="6802" w:type="dxa"/>
             <w:tcBorders/>
             <w:shd w:color="auto" w:fill="auto" w:val="clear"/>
           </w:tcPr>
@@ -16713,7 +17360,7 @@
         <w:trPr/>
         <w:tc>
           <w:tcPr>
-            <w:tcW w:w="2153" w:type="dxa"/>
+            <w:tcW w:w="2152" w:type="dxa"/>
             <w:tcBorders/>
             <w:shd w:color="auto" w:fill="auto" w:val="clear"/>
           </w:tcPr>
@@ -16734,7 +17381,7 @@
         </w:tc>
         <w:tc>
           <w:tcPr>
-            <w:tcW w:w="6801" w:type="dxa"/>
+            <w:tcW w:w="6802" w:type="dxa"/>
             <w:tcBorders/>
             <w:shd w:color="auto" w:fill="auto" w:val="clear"/>
           </w:tcPr>
@@ -16760,7 +17407,7 @@
         <w:trPr/>
         <w:tc>
           <w:tcPr>
-            <w:tcW w:w="2153" w:type="dxa"/>
+            <w:tcW w:w="2152" w:type="dxa"/>
             <w:tcBorders/>
             <w:shd w:color="auto" w:fill="auto" w:val="clear"/>
           </w:tcPr>
@@ -16781,7 +17428,7 @@
         </w:tc>
         <w:tc>
           <w:tcPr>
-            <w:tcW w:w="6801" w:type="dxa"/>
+            <w:tcW w:w="6802" w:type="dxa"/>
             <w:tcBorders/>
             <w:shd w:color="auto" w:fill="auto" w:val="clear"/>
           </w:tcPr>
@@ -16823,7 +17470,7 @@
         <w:trPr/>
         <w:tc>
           <w:tcPr>
-            <w:tcW w:w="2153" w:type="dxa"/>
+            <w:tcW w:w="2152" w:type="dxa"/>
             <w:tcBorders/>
             <w:shd w:color="auto" w:fill="auto" w:val="clear"/>
           </w:tcPr>
@@ -16846,7 +17493,7 @@
         </w:tc>
         <w:tc>
           <w:tcPr>
-            <w:tcW w:w="6801" w:type="dxa"/>
+            <w:tcW w:w="6802" w:type="dxa"/>
             <w:tcBorders/>
             <w:shd w:color="auto" w:fill="auto" w:val="clear"/>
           </w:tcPr>
@@ -16870,7 +17517,7 @@
         <w:trPr/>
         <w:tc>
           <w:tcPr>
-            <w:tcW w:w="2153" w:type="dxa"/>
+            <w:tcW w:w="2152" w:type="dxa"/>
             <w:tcBorders/>
             <w:shd w:color="auto" w:fill="auto" w:val="clear"/>
           </w:tcPr>
@@ -16893,7 +17540,7 @@
         </w:tc>
         <w:tc>
           <w:tcPr>
-            <w:tcW w:w="6801" w:type="dxa"/>
+            <w:tcW w:w="6802" w:type="dxa"/>
             <w:tcBorders/>
             <w:shd w:color="auto" w:fill="auto" w:val="clear"/>
           </w:tcPr>
@@ -16915,7 +17562,7 @@
         <w:trPr/>
         <w:tc>
           <w:tcPr>
-            <w:tcW w:w="2153" w:type="dxa"/>
+            <w:tcW w:w="2152" w:type="dxa"/>
             <w:tcBorders/>
             <w:shd w:color="auto" w:fill="auto" w:val="clear"/>
           </w:tcPr>
@@ -16938,7 +17585,7 @@
         </w:tc>
         <w:tc>
           <w:tcPr>
-            <w:tcW w:w="6801" w:type="dxa"/>
+            <w:tcW w:w="6802" w:type="dxa"/>
             <w:tcBorders/>
             <w:shd w:color="auto" w:fill="auto" w:val="clear"/>
           </w:tcPr>
@@ -17079,24 +17726,13 @@
     <w:p>
       <w:pPr>
         <w:pStyle w:val="Normal"/>
-        <w:rPr>
-          <w:rFonts w:ascii="Verdana" w:hAnsi="Verdana" w:cs="Verdana"/>
-        </w:rPr>
+        <w:rPr/>
       </w:pPr>
       <w:r>
         <w:rPr>
           <w:rFonts w:cs="Verdana" w:ascii="Verdana" w:hAnsi="Verdana"/>
         </w:rPr>
         <w:t>Het is een overzienbare inspanning om te 'locaten' naar andere talen zoals Zweeds, Noors, Duits of Frans.</w:t>
-      </w:r>
-    </w:p>
-    <w:p>
-      <w:pPr>
-        <w:pStyle w:val="Normal"/>
-        <w:rPr/>
-      </w:pPr>
-      <w:r>
-        <w:rPr/>
       </w:r>
       <w:r>
         <w:br w:type="page"/>
@@ -17325,7 +17961,7 @@
     </w:r>
     <w:r>
       <w:rPr/>
-      <w:t>Gebruikershandleiding voor IBOS XML muzieklezer versie 4.0.0.0.docx</w:t>
+      <w:t>Gebruikershandleiding voor IBOS XML muzieklezer versie 5.0.0.0.docx</w:t>
     </w:r>
     <w:r>
       <w:rPr/>
@@ -17367,7 +18003,7 @@
       <w:rPr>
         <w:rStyle w:val="Sidetal"/>
       </w:rPr>
-      <w:t>30</w:t>
+      <w:t>31</w:t>
     </w:r>
     <w:r>
       <w:rPr>

</xml_diff>